<commit_message>
update: implement Singleton task and update report.
</commit_message>
<xml_diff>
--- a/lab11/Лабораторна робота №11.docx
+++ b/lab11/Лабораторна робота №11.docx
@@ -434,6 +434,8 @@
           <w:numId w:val="9"/>
         </w:numPr>
         <w:spacing w:line="360" w:lineRule="auto"/>
+        <w:ind w:left="0" w:firstLine="709"/>
+        <w:contextualSpacing w:val="0"/>
         <w:jc w:val="both"/>
         <w:rPr>
           <w:noProof/>
@@ -461,6 +463,8 @@
           <w:numId w:val="9"/>
         </w:numPr>
         <w:spacing w:line="360" w:lineRule="auto"/>
+        <w:ind w:left="0" w:firstLine="709"/>
+        <w:contextualSpacing w:val="0"/>
         <w:jc w:val="both"/>
         <w:rPr>
           <w:noProof/>
@@ -488,6 +492,8 @@
           <w:numId w:val="9"/>
         </w:numPr>
         <w:spacing w:line="360" w:lineRule="auto"/>
+        <w:ind w:left="0" w:firstLine="709"/>
+        <w:contextualSpacing w:val="0"/>
         <w:jc w:val="both"/>
         <w:rPr>
           <w:noProof/>
@@ -515,6 +521,8 @@
           <w:numId w:val="9"/>
         </w:numPr>
         <w:spacing w:line="360" w:lineRule="auto"/>
+        <w:ind w:left="0" w:firstLine="709"/>
+        <w:contextualSpacing w:val="0"/>
         <w:jc w:val="both"/>
         <w:rPr>
           <w:noProof/>
@@ -542,6 +550,8 @@
           <w:numId w:val="9"/>
         </w:numPr>
         <w:spacing w:line="360" w:lineRule="auto"/>
+        <w:ind w:left="0" w:firstLine="709"/>
+        <w:contextualSpacing w:val="0"/>
         <w:jc w:val="both"/>
         <w:rPr>
           <w:noProof/>
@@ -3121,7 +3131,7 @@
           <w:noProof/>
           <w:sz w:val="28"/>
           <w:szCs w:val="28"/>
-          <w:lang w:val="uk-UA"/>
+          <w:lang w:val="en-US"/>
         </w:rPr>
       </w:pPr>
       <w:r>
@@ -3133,7 +3143,18 @@
           <w:szCs w:val="28"/>
           <w:lang w:val="uk-UA"/>
         </w:rPr>
-        <w:t>Завдання 2. Abstract Factory</w:t>
+        <w:t xml:space="preserve">Завдання 2. </w:t>
+      </w:r>
+      <w:r>
+        <w:rPr>
+          <w:b/>
+          <w:bCs/>
+          <w:noProof/>
+          <w:sz w:val="28"/>
+          <w:szCs w:val="28"/>
+          <w:lang w:val="en-US"/>
+        </w:rPr>
+        <w:t>Singleton</w:t>
       </w:r>
     </w:p>
     <w:p>
@@ -3164,18 +3185,8 @@
           <w:noProof/>
           <w:sz w:val="28"/>
           <w:szCs w:val="28"/>
-          <w:lang w:val="uk-UA"/>
-        </w:rPr>
-        <w:t>кросплатформений GUI-тюнер (Windows та Mac)</w:t>
-      </w:r>
-      <w:r>
-        <w:rPr>
-          <w:noProof/>
-          <w:sz w:val="28"/>
-          <w:szCs w:val="28"/>
-          <w:lang w:val="uk-UA"/>
-        </w:rPr>
-        <w:t>.</w:t>
+        </w:rPr>
+        <w:t>менеджер конфігурацій програми.</w:t>
       </w:r>
     </w:p>
     <w:p>
@@ -3206,16 +3217,15 @@
     </w:p>
     <w:p>
       <w:pPr>
+        <w:pStyle w:val="a6"/>
         <w:widowControl/>
         <w:numPr>
           <w:ilvl w:val="0"/>
-          <w:numId w:val="7"/>
+          <w:numId w:val="10"/>
         </w:numPr>
-        <w:tabs>
-          <w:tab w:val="num" w:pos="720"/>
-        </w:tabs>
         <w:spacing w:line="360" w:lineRule="auto"/>
         <w:ind w:left="0" w:firstLine="709"/>
+        <w:contextualSpacing w:val="0"/>
         <w:jc w:val="both"/>
         <w:rPr>
           <w:noProof/>
@@ -3229,23 +3239,21 @@
           <w:noProof/>
           <w:sz w:val="28"/>
           <w:szCs w:val="28"/>
-          <w:lang w:val="uk-UA"/>
-        </w:rPr>
-        <w:t>Описати сімейства продуктів: Button i Checkbox.</w:t>
-      </w:r>
-    </w:p>
-    <w:p>
-      <w:pPr>
+        </w:rPr>
+        <w:t>Реалізувати клас ConfigurationManager як Singleton, який читає налаштування з файлу (JSON/INI).</w:t>
+      </w:r>
+    </w:p>
+    <w:p>
+      <w:pPr>
+        <w:pStyle w:val="a6"/>
         <w:widowControl/>
         <w:numPr>
           <w:ilvl w:val="0"/>
-          <w:numId w:val="7"/>
+          <w:numId w:val="10"/>
         </w:numPr>
-        <w:tabs>
-          <w:tab w:val="num" w:pos="720"/>
-        </w:tabs>
         <w:spacing w:line="360" w:lineRule="auto"/>
         <w:ind w:left="0" w:firstLine="709"/>
+        <w:contextualSpacing w:val="0"/>
         <w:jc w:val="both"/>
         <w:rPr>
           <w:noProof/>
@@ -3259,23 +3267,21 @@
           <w:noProof/>
           <w:sz w:val="28"/>
           <w:szCs w:val="28"/>
-          <w:lang w:val="uk-UA"/>
-        </w:rPr>
-        <w:t>Визначити інтерфейси IButton та ICheckbox із типовими методами Render() i OnClick().</w:t>
-      </w:r>
-    </w:p>
-    <w:p>
-      <w:pPr>
+        </w:rPr>
+        <w:t>(Необов’язкове завдання) Забезпечте, щоб створення єдиного екземпляра було безпечним для використання в багатопотоковому середовищі (наприклад, через lock, Lazy або інші механізми).</w:t>
+      </w:r>
+    </w:p>
+    <w:p>
+      <w:pPr>
+        <w:pStyle w:val="a6"/>
         <w:widowControl/>
         <w:numPr>
           <w:ilvl w:val="0"/>
-          <w:numId w:val="7"/>
+          <w:numId w:val="10"/>
         </w:numPr>
-        <w:tabs>
-          <w:tab w:val="num" w:pos="720"/>
-        </w:tabs>
         <w:spacing w:line="360" w:lineRule="auto"/>
         <w:ind w:left="0" w:firstLine="709"/>
+        <w:contextualSpacing w:val="0"/>
         <w:jc w:val="both"/>
         <w:rPr>
           <w:noProof/>
@@ -3289,23 +3295,21 @@
           <w:noProof/>
           <w:sz w:val="28"/>
           <w:szCs w:val="28"/>
-          <w:lang w:val="uk-UA"/>
-        </w:rPr>
-        <w:t>Створити абстрактну фабрику IUIFactory з методами CreateButton() i CreateCheckbox().</w:t>
-      </w:r>
-    </w:p>
-    <w:p>
-      <w:pPr>
+        </w:rPr>
+        <w:t>Додати метод string GetSetting(string key) для отримання значень.</w:t>
+      </w:r>
+    </w:p>
+    <w:p>
+      <w:pPr>
+        <w:pStyle w:val="a6"/>
         <w:widowControl/>
         <w:numPr>
           <w:ilvl w:val="0"/>
-          <w:numId w:val="7"/>
+          <w:numId w:val="10"/>
         </w:numPr>
-        <w:tabs>
-          <w:tab w:val="num" w:pos="720"/>
-        </w:tabs>
         <w:spacing w:line="360" w:lineRule="auto"/>
         <w:ind w:left="0" w:firstLine="709"/>
+        <w:contextualSpacing w:val="0"/>
         <w:jc w:val="both"/>
         <w:rPr>
           <w:noProof/>
@@ -3319,53 +3323,9 @@
           <w:noProof/>
           <w:sz w:val="28"/>
           <w:szCs w:val="28"/>
-          <w:lang w:val="uk-UA"/>
-        </w:rPr>
-        <w:t>Реалізувати дві конкретні фабрики: WindowsFactory i MacFactory.</w:t>
-      </w:r>
-    </w:p>
-    <w:p>
-      <w:pPr>
-        <w:widowControl/>
-        <w:numPr>
-          <w:ilvl w:val="0"/>
-          <w:numId w:val="7"/>
-        </w:numPr>
-        <w:tabs>
-          <w:tab w:val="num" w:pos="720"/>
-        </w:tabs>
-        <w:spacing w:line="360" w:lineRule="auto"/>
-        <w:ind w:left="0" w:firstLine="709"/>
-        <w:jc w:val="both"/>
-        <w:rPr>
-          <w:noProof/>
-          <w:sz w:val="28"/>
-          <w:szCs w:val="28"/>
-          <w:lang w:val="uk-UA"/>
-        </w:rPr>
-      </w:pPr>
-      <w:r>
-        <w:rPr>
-          <w:noProof/>
-          <w:sz w:val="28"/>
-          <w:szCs w:val="28"/>
-          <w:lang w:val="uk-UA"/>
-        </w:rPr>
-        <w:t>Написати код, що залежно від платформи обирає потрібну фабрику та малює елементи інтерфейсу.</w:t>
-      </w:r>
-    </w:p>
-    <w:p>
-      <w:pPr>
-        <w:widowControl/>
-        <w:spacing w:line="360" w:lineRule="auto"/>
-        <w:jc w:val="both"/>
-        <w:rPr>
-          <w:noProof/>
-          <w:sz w:val="28"/>
-          <w:szCs w:val="28"/>
-          <w:lang w:val="uk-UA"/>
-        </w:rPr>
-      </w:pPr>
+        </w:rPr>
+        <w:t>У тестовому коді показати, що всі звернення до ConfigurationManager.Instance повертають один і той самий об’єкт.</w:t>
+      </w:r>
     </w:p>
     <w:p>
       <w:pPr>
@@ -3415,39 +3375,35 @@
           <w:szCs w:val="28"/>
           <w:lang w:val="uk-UA"/>
         </w:rPr>
-        <w:t>В процесі виконання завдання було спроєктовано архітектуру кросплатформеного GUI-тюнера на основі патерну Abstract Factory. Цей патерн дозволяє створювати сімейства пов'язаних об'єктів (кнопки та чекбокси) без прив'язки до їхніх конкретних класів.</w:t>
-      </w:r>
-      <w:r>
-        <w:rPr>
-          <w:noProof/>
-          <w:sz w:val="28"/>
-          <w:szCs w:val="28"/>
-          <w:lang w:val="uk-UA"/>
-        </w:rPr>
-        <w:t xml:space="preserve"> Було створено інтерфейси IButton та ICheckbox, які реалізуються конкретними класами для кожної операційної системи (WindowsButton, MacButton тощо). Для створення цих об'єктів використовується абстрактна фабрика IUIFactory та її реалізації WindowsFactory і MacFactory. Логіка взаємодії інкапсульована в класі Application, який нічого не знає про конкретні класи платформ, </w:t>
-      </w:r>
-      <w:r>
-        <w:rPr>
-          <w:noProof/>
-          <w:sz w:val="28"/>
-          <w:szCs w:val="28"/>
-          <w:lang w:val="uk-UA"/>
-        </w:rPr>
-        <w:lastRenderedPageBreak/>
-        <w:t>а працює виключно через інтерфейси.</w:t>
-      </w:r>
-    </w:p>
-    <w:p>
-      <w:pPr>
-        <w:spacing w:line="360" w:lineRule="auto"/>
-        <w:jc w:val="both"/>
-        <w:rPr>
-          <w:noProof/>
-          <w:sz w:val="28"/>
-          <w:szCs w:val="28"/>
-          <w:lang w:val="uk-UA"/>
-        </w:rPr>
-      </w:pPr>
+        <w:t>Singleton гарантує, що клас має лише один екземпляр, і надає глобальну точку доступу до нього. У даній задачі це дозволяє уникнути багаторазового зчитування файлу конфігурації з диска та забезпечує єдине джерело налаштувань для всієї програми.</w:t>
+      </w:r>
+      <w:r>
+        <w:rPr>
+          <w:noProof/>
+          <w:sz w:val="28"/>
+          <w:szCs w:val="28"/>
+          <w:lang w:val="uk-UA"/>
+        </w:rPr>
+        <w:t xml:space="preserve"> </w:t>
+      </w:r>
+      <w:r>
+        <w:rPr>
+          <w:noProof/>
+          <w:sz w:val="28"/>
+          <w:szCs w:val="28"/>
+          <w:lang w:val="uk-UA"/>
+        </w:rPr>
+        <w:t>Для забезпечення потокобезпечності (thread-safety) під час створення екземпляра було використано сучасний механізм Lazy&lt;T&gt;. Він гарантує, що об'єкт ConfigurationManager буде створено лише один раз, навіть якщо декілька потоків одночасно звернуться до властивості Instance. Дані конфігурації зчитуються з формату JSON за допомогою System.Text.Json під час ініціалізації об'єкта та зберігаються у приватному словнику</w:t>
+      </w:r>
+      <w:r>
+        <w:rPr>
+          <w:noProof/>
+          <w:sz w:val="28"/>
+          <w:szCs w:val="28"/>
+          <w:lang w:val="uk-UA"/>
+        </w:rPr>
+        <w:t>.</w:t>
+      </w:r>
     </w:p>
     <w:p>
       <w:pPr>
@@ -3470,6 +3426,7 @@
           <w:szCs w:val="28"/>
           <w:lang w:val="uk-UA"/>
         </w:rPr>
+        <w:lastRenderedPageBreak/>
         <w:t>Діаграма класів</w:t>
       </w:r>
     </w:p>
@@ -3492,7 +3449,7 @@
           <w:szCs w:val="28"/>
           <w:lang w:val="uk-UA"/>
         </w:rPr>
-        <w:t>Діаграма ілюструє структуру патерну Abstract Factory: інтерфейси продуктів та фабрик, їх конкретні реалізації, а також клас Application, який залежить лише від абстракцій.</w:t>
+        <w:t>На діаграмі класів видно структуру патерну: приватний конструктор, приватне статичне поле екземпляра та публічна статична властивість доступу.</w:t>
       </w:r>
     </w:p>
     <w:p>
@@ -3514,9 +3471,9 @@
           <w:lang w:val="uk-UA"/>
         </w:rPr>
         <w:drawing>
-          <wp:inline distT="0" distB="0" distL="0" distR="0" wp14:anchorId="2214713E" wp14:editId="4553BAB4">
-            <wp:extent cx="6480000" cy="4389678"/>
-            <wp:effectExtent l="0" t="0" r="0" b="0"/>
+          <wp:inline distT="0" distB="0" distL="0" distR="0" wp14:anchorId="2214713E" wp14:editId="0202BD8D">
+            <wp:extent cx="3600000" cy="4628573"/>
+            <wp:effectExtent l="0" t="0" r="635" b="635"/>
             <wp:docPr id="7" name="Рисунок 7"/>
             <wp:cNvGraphicFramePr>
               <a:graphicFrameLocks xmlns:a="http://schemas.openxmlformats.org/drawingml/2006/main" noChangeAspect="1"/>
@@ -3543,7 +3500,7 @@
                   <pic:spPr>
                     <a:xfrm>
                       <a:off x="0" y="0"/>
-                      <a:ext cx="6480000" cy="4389678"/>
+                      <a:ext cx="3600000" cy="4628573"/>
                     </a:xfrm>
                     <a:prstGeom prst="rect">
                       <a:avLst/>
@@ -3558,6 +3515,26 @@
     </w:p>
     <w:p>
       <w:pPr>
+        <w:spacing w:line="360" w:lineRule="auto"/>
+        <w:rPr>
+          <w:noProof/>
+          <w:sz w:val="28"/>
+          <w:szCs w:val="28"/>
+          <w:lang w:val="uk-UA"/>
+        </w:rPr>
+      </w:pPr>
+    </w:p>
+    <w:p>
+      <w:pPr>
+        <w:spacing w:line="360" w:lineRule="auto"/>
+        <w:rPr>
+          <w:noProof/>
+          <w:sz w:val="28"/>
+          <w:szCs w:val="28"/>
+          <w:lang w:val="uk-UA"/>
+        </w:rPr>
+      </w:pPr>
+      <w:r>
         <w:rPr>
           <w:b/>
           <w:bCs/>
@@ -3566,177 +3543,6 @@
           <w:szCs w:val="28"/>
           <w:lang w:val="uk-UA"/>
         </w:rPr>
-      </w:pPr>
-      <w:r>
-        <w:rPr>
-          <w:b/>
-          <w:bCs/>
-          <w:noProof/>
-          <w:sz w:val="28"/>
-          <w:szCs w:val="28"/>
-          <w:lang w:val="uk-UA"/>
-        </w:rPr>
-        <w:br w:type="page"/>
-      </w:r>
-    </w:p>
-    <w:p>
-      <w:pPr>
-        <w:spacing w:line="360" w:lineRule="auto"/>
-        <w:ind w:firstLine="709"/>
-        <w:jc w:val="both"/>
-        <w:rPr>
-          <w:noProof/>
-          <w:sz w:val="28"/>
-          <w:szCs w:val="28"/>
-          <w:lang w:val="uk-UA"/>
-        </w:rPr>
-      </w:pPr>
-      <w:r>
-        <w:rPr>
-          <w:b/>
-          <w:bCs/>
-          <w:noProof/>
-          <w:sz w:val="28"/>
-          <w:szCs w:val="28"/>
-          <w:lang w:val="uk-UA"/>
-        </w:rPr>
-        <w:lastRenderedPageBreak/>
-        <w:t>Діаграма послідовност</w:t>
-      </w:r>
-      <w:r>
-        <w:rPr>
-          <w:b/>
-          <w:bCs/>
-          <w:noProof/>
-          <w:sz w:val="28"/>
-          <w:szCs w:val="28"/>
-          <w:lang w:val="uk-UA"/>
-        </w:rPr>
-        <w:t>і</w:t>
-      </w:r>
-    </w:p>
-    <w:p>
-      <w:pPr>
-        <w:spacing w:line="360" w:lineRule="auto"/>
-        <w:ind w:firstLine="709"/>
-        <w:jc w:val="both"/>
-        <w:rPr>
-          <w:noProof/>
-          <w:sz w:val="28"/>
-          <w:szCs w:val="28"/>
-          <w:lang w:val="uk-UA"/>
-        </w:rPr>
-      </w:pPr>
-      <w:r>
-        <w:rPr>
-          <w:noProof/>
-          <w:sz w:val="28"/>
-          <w:szCs w:val="28"/>
-          <w:lang w:val="uk-UA"/>
-        </w:rPr>
-        <w:t>Діаграма демонструє процес конфігурації програми для середовища Windows. Показано створення WindowsFactory, передачу її в Application, де через фабрику створюються відповідні елементи UI та викликаються їх методи рендерингу та взаємодії.</w:t>
-      </w:r>
-    </w:p>
-    <w:p>
-      <w:pPr>
-        <w:spacing w:line="360" w:lineRule="auto"/>
-        <w:jc w:val="both"/>
-        <w:rPr>
-          <w:noProof/>
-          <w:sz w:val="28"/>
-          <w:szCs w:val="28"/>
-          <w:lang w:val="uk-UA"/>
-        </w:rPr>
-      </w:pPr>
-      <w:r>
-        <w:rPr>
-          <w:noProof/>
-          <w:sz w:val="28"/>
-          <w:szCs w:val="28"/>
-          <w:lang w:val="uk-UA"/>
-        </w:rPr>
-        <w:drawing>
-          <wp:inline distT="0" distB="0" distL="0" distR="0" wp14:anchorId="4F14EAD8" wp14:editId="67E48838">
-            <wp:extent cx="6480175" cy="6420485"/>
-            <wp:effectExtent l="0" t="0" r="0" b="0"/>
-            <wp:docPr id="11" name="Рисунок 11" descr="Зображення, що містить текст, схема, Паралель, Креслення&#10;&#10;Вміст, створений ШІ, може бути неправильним."/>
-            <wp:cNvGraphicFramePr>
-              <a:graphicFrameLocks xmlns:a="http://schemas.openxmlformats.org/drawingml/2006/main" noChangeAspect="1"/>
-            </wp:cNvGraphicFramePr>
-            <a:graphic xmlns:a="http://schemas.openxmlformats.org/drawingml/2006/main">
-              <a:graphicData uri="http://schemas.openxmlformats.org/drawingml/2006/picture">
-                <pic:pic xmlns:pic="http://schemas.openxmlformats.org/drawingml/2006/picture">
-                  <pic:nvPicPr>
-                    <pic:cNvPr id="11" name="Рисунок 11" descr="Зображення, що містить текст, схема, Паралель, Креслення&#10;&#10;Вміст, створений ШІ, може бути неправильним."/>
-                    <pic:cNvPicPr/>
-                  </pic:nvPicPr>
-                  <pic:blipFill>
-                    <a:blip r:embed="rId11">
-                      <a:extLst>
-                        <a:ext uri="{28A0092B-C50C-407E-A947-70E740481C1C}">
-                          <a14:useLocalDpi xmlns:a14="http://schemas.microsoft.com/office/drawing/2010/main" val="0"/>
-                        </a:ext>
-                      </a:extLst>
-                    </a:blip>
-                    <a:stretch>
-                      <a:fillRect/>
-                    </a:stretch>
-                  </pic:blipFill>
-                  <pic:spPr>
-                    <a:xfrm>
-                      <a:off x="0" y="0"/>
-                      <a:ext cx="6480175" cy="6420485"/>
-                    </a:xfrm>
-                    <a:prstGeom prst="rect">
-                      <a:avLst/>
-                    </a:prstGeom>
-                  </pic:spPr>
-                </pic:pic>
-              </a:graphicData>
-            </a:graphic>
-          </wp:inline>
-        </w:drawing>
-      </w:r>
-    </w:p>
-    <w:p>
-      <w:pPr>
-        <w:rPr>
-          <w:noProof/>
-          <w:sz w:val="28"/>
-          <w:szCs w:val="28"/>
-          <w:lang w:val="uk-UA"/>
-        </w:rPr>
-      </w:pPr>
-      <w:r>
-        <w:rPr>
-          <w:noProof/>
-          <w:sz w:val="28"/>
-          <w:szCs w:val="28"/>
-          <w:lang w:val="uk-UA"/>
-        </w:rPr>
-        <w:br w:type="page"/>
-      </w:r>
-    </w:p>
-    <w:p>
-      <w:pPr>
-        <w:spacing w:line="360" w:lineRule="auto"/>
-        <w:rPr>
-          <w:noProof/>
-          <w:sz w:val="28"/>
-          <w:szCs w:val="28"/>
-          <w:lang w:val="uk-UA"/>
-        </w:rPr>
-      </w:pPr>
-      <w:r>
-        <w:rPr>
-          <w:b/>
-          <w:bCs/>
-          <w:noProof/>
-          <w:sz w:val="28"/>
-          <w:szCs w:val="28"/>
-          <w:lang w:val="uk-UA"/>
-        </w:rPr>
-        <w:lastRenderedPageBreak/>
         <w:t>Код:</w:t>
       </w:r>
     </w:p>
@@ -3756,9 +3562,18 @@
           <w:noProof/>
           <w:sz w:val="28"/>
           <w:szCs w:val="28"/>
-          <w:lang w:val="uk-UA"/>
-        </w:rPr>
-        <w:t>IUIFactory.cs</w:t>
+          <w:lang w:val="en-US"/>
+        </w:rPr>
+        <w:t>ConfigurationManager</w:t>
+      </w:r>
+      <w:r>
+        <w:rPr>
+          <w:noProof/>
+          <w:sz w:val="28"/>
+          <w:szCs w:val="28"/>
+          <w:lang w:val="uk-UA"/>
+        </w:rPr>
+        <w:t>.cs</w:t>
       </w:r>
     </w:p>
     <w:p>
@@ -3787,36 +3602,36 @@
           <w:rFonts w:ascii="Courier New" w:hAnsi="Courier New" w:cs="Courier New"/>
           <w:noProof/>
           <w:color w:val="000000" w:themeColor="text1"/>
-          <w:lang w:val="uk-UA"/>
-        </w:rPr>
-      </w:pPr>
-      <w:r>
-        <w:rPr>
-          <w:rFonts w:ascii="Courier New" w:hAnsi="Courier New" w:cs="Courier New"/>
-          <w:noProof/>
-          <w:color w:val="000000" w:themeColor="text1"/>
-          <w:lang w:val="uk-UA"/>
-        </w:rPr>
-        <w:t>namespace abstract_factory;</w:t>
-      </w:r>
-      <w:r>
-        <w:rPr>
-          <w:rFonts w:ascii="Courier New" w:hAnsi="Courier New" w:cs="Courier New"/>
-          <w:noProof/>
-          <w:color w:val="000000" w:themeColor="text1"/>
-          <w:lang w:val="uk-UA"/>
-        </w:rPr>
-        <w:br/>
-      </w:r>
-      <w:r>
-        <w:rPr>
-          <w:rFonts w:ascii="Courier New" w:hAnsi="Courier New" w:cs="Courier New"/>
-          <w:noProof/>
-          <w:color w:val="000000" w:themeColor="text1"/>
-          <w:lang w:val="uk-UA"/>
-        </w:rPr>
-        <w:br/>
-        <w:t>public interface IUIFactory</w:t>
+          <w:lang w:val="en-US"/>
+        </w:rPr>
+      </w:pPr>
+      <w:r>
+        <w:rPr>
+          <w:rFonts w:ascii="Courier New" w:hAnsi="Courier New" w:cs="Courier New"/>
+          <w:noProof/>
+          <w:color w:val="000000" w:themeColor="text1"/>
+          <w:lang w:val="uk-UA"/>
+        </w:rPr>
+        <w:t>using System.Text.Json;</w:t>
+      </w:r>
+      <w:r>
+        <w:rPr>
+          <w:rFonts w:ascii="Courier New" w:hAnsi="Courier New" w:cs="Courier New"/>
+          <w:noProof/>
+          <w:color w:val="000000" w:themeColor="text1"/>
+          <w:lang w:val="uk-UA"/>
+        </w:rPr>
+        <w:br/>
+      </w:r>
+      <w:r>
+        <w:rPr>
+          <w:rFonts w:ascii="Courier New" w:hAnsi="Courier New" w:cs="Courier New"/>
+          <w:noProof/>
+          <w:color w:val="000000" w:themeColor="text1"/>
+          <w:lang w:val="uk-UA"/>
+        </w:rPr>
+        <w:br/>
+        <w:t>namespace singleton</w:t>
       </w:r>
       <w:r>
         <w:rPr>
@@ -3836,17 +3651,515 @@
           <w:lang w:val="uk-UA"/>
         </w:rPr>
         <w:br/>
-        <w:t xml:space="preserve">    IButton CreateButton();</w:t>
-      </w:r>
-      <w:r>
-        <w:rPr>
-          <w:rFonts w:ascii="Courier New" w:hAnsi="Courier New" w:cs="Courier New"/>
-          <w:noProof/>
-          <w:color w:val="000000" w:themeColor="text1"/>
-          <w:lang w:val="uk-UA"/>
-        </w:rPr>
-        <w:br/>
-        <w:t xml:space="preserve">    ICheckbox CreateCheckbox();</w:t>
+        <w:t xml:space="preserve">    public sealed class ConfigurationManager</w:t>
+      </w:r>
+      <w:r>
+        <w:rPr>
+          <w:rFonts w:ascii="Courier New" w:hAnsi="Courier New" w:cs="Courier New"/>
+          <w:noProof/>
+          <w:color w:val="000000" w:themeColor="text1"/>
+          <w:lang w:val="uk-UA"/>
+        </w:rPr>
+        <w:br/>
+        <w:t xml:space="preserve">    {</w:t>
+      </w:r>
+      <w:r>
+        <w:rPr>
+          <w:rFonts w:ascii="Courier New" w:hAnsi="Courier New" w:cs="Courier New"/>
+          <w:noProof/>
+          <w:color w:val="000000" w:themeColor="text1"/>
+          <w:lang w:val="uk-UA"/>
+        </w:rPr>
+        <w:br/>
+        <w:t xml:space="preserve">        private static readonly Lazy&lt;ConfigurationManager&gt; _instance = new Lazy&lt;ConfigurationManager&gt;(() =&gt; new ConfigurationManager());</w:t>
+      </w:r>
+      <w:r>
+        <w:rPr>
+          <w:rFonts w:ascii="Courier New" w:hAnsi="Courier New" w:cs="Courier New"/>
+          <w:noProof/>
+          <w:color w:val="000000" w:themeColor="text1"/>
+          <w:lang w:val="uk-UA"/>
+        </w:rPr>
+        <w:br/>
+        <w:t xml:space="preserve">        private Dictionary&lt;string, string&gt; _settings;</w:t>
+      </w:r>
+      <w:r>
+        <w:rPr>
+          <w:rFonts w:ascii="Courier New" w:hAnsi="Courier New" w:cs="Courier New"/>
+          <w:noProof/>
+          <w:color w:val="000000" w:themeColor="text1"/>
+          <w:lang w:val="uk-UA"/>
+        </w:rPr>
+        <w:br/>
+        <w:t xml:space="preserve">        private readonly string _configFilePath = "config.json";</w:t>
+      </w:r>
+      <w:r>
+        <w:rPr>
+          <w:rFonts w:ascii="Courier New" w:hAnsi="Courier New" w:cs="Courier New"/>
+          <w:noProof/>
+          <w:color w:val="000000" w:themeColor="text1"/>
+          <w:lang w:val="uk-UA"/>
+        </w:rPr>
+        <w:br/>
+        <w:t xml:space="preserve">        </w:t>
+      </w:r>
+      <w:r>
+        <w:rPr>
+          <w:rFonts w:ascii="Courier New" w:hAnsi="Courier New" w:cs="Courier New"/>
+          <w:noProof/>
+          <w:color w:val="000000" w:themeColor="text1"/>
+          <w:lang w:val="uk-UA"/>
+        </w:rPr>
+        <w:br/>
+        <w:t xml:space="preserve">        private ConfigurationManager()</w:t>
+      </w:r>
+      <w:r>
+        <w:rPr>
+          <w:rFonts w:ascii="Courier New" w:hAnsi="Courier New" w:cs="Courier New"/>
+          <w:noProof/>
+          <w:color w:val="000000" w:themeColor="text1"/>
+          <w:lang w:val="uk-UA"/>
+        </w:rPr>
+        <w:br/>
+        <w:t xml:space="preserve">        {</w:t>
+      </w:r>
+      <w:r>
+        <w:rPr>
+          <w:rFonts w:ascii="Courier New" w:hAnsi="Courier New" w:cs="Courier New"/>
+          <w:noProof/>
+          <w:color w:val="000000" w:themeColor="text1"/>
+          <w:lang w:val="uk-UA"/>
+        </w:rPr>
+        <w:br/>
+        <w:t xml:space="preserve">            _settings = new Dictionary&lt;string, string&gt;();</w:t>
+      </w:r>
+      <w:r>
+        <w:rPr>
+          <w:rFonts w:ascii="Courier New" w:hAnsi="Courier New" w:cs="Courier New"/>
+          <w:noProof/>
+          <w:color w:val="000000" w:themeColor="text1"/>
+          <w:lang w:val="uk-UA"/>
+        </w:rPr>
+        <w:br/>
+        <w:t xml:space="preserve">            LoadConfiguration();</w:t>
+      </w:r>
+      <w:r>
+        <w:rPr>
+          <w:rFonts w:ascii="Courier New" w:hAnsi="Courier New" w:cs="Courier New"/>
+          <w:noProof/>
+          <w:color w:val="000000" w:themeColor="text1"/>
+          <w:lang w:val="uk-UA"/>
+        </w:rPr>
+        <w:br/>
+        <w:t xml:space="preserve">        }</w:t>
+      </w:r>
+      <w:r>
+        <w:rPr>
+          <w:rFonts w:ascii="Courier New" w:hAnsi="Courier New" w:cs="Courier New"/>
+          <w:noProof/>
+          <w:color w:val="000000" w:themeColor="text1"/>
+          <w:lang w:val="uk-UA"/>
+        </w:rPr>
+        <w:br/>
+        <w:t xml:space="preserve">        </w:t>
+      </w:r>
+      <w:r>
+        <w:rPr>
+          <w:rFonts w:ascii="Courier New" w:hAnsi="Courier New" w:cs="Courier New"/>
+          <w:noProof/>
+          <w:color w:val="000000" w:themeColor="text1"/>
+          <w:lang w:val="uk-UA"/>
+        </w:rPr>
+        <w:br/>
+        <w:t xml:space="preserve">        public static ConfigurationManager Instance</w:t>
+      </w:r>
+      <w:r>
+        <w:rPr>
+          <w:rFonts w:ascii="Courier New" w:hAnsi="Courier New" w:cs="Courier New"/>
+          <w:noProof/>
+          <w:color w:val="000000" w:themeColor="text1"/>
+          <w:lang w:val="uk-UA"/>
+        </w:rPr>
+        <w:br/>
+      </w:r>
+      <w:r>
+        <w:rPr>
+          <w:rFonts w:ascii="Courier New" w:hAnsi="Courier New" w:cs="Courier New"/>
+          <w:noProof/>
+          <w:color w:val="000000" w:themeColor="text1"/>
+          <w:lang w:val="uk-UA"/>
+        </w:rPr>
+        <w:lastRenderedPageBreak/>
+        <w:t xml:space="preserve">        {</w:t>
+      </w:r>
+      <w:r>
+        <w:rPr>
+          <w:rFonts w:ascii="Courier New" w:hAnsi="Courier New" w:cs="Courier New"/>
+          <w:noProof/>
+          <w:color w:val="000000" w:themeColor="text1"/>
+          <w:lang w:val="uk-UA"/>
+        </w:rPr>
+        <w:br/>
+        <w:t xml:space="preserve">            get</w:t>
+      </w:r>
+      <w:r>
+        <w:rPr>
+          <w:rFonts w:ascii="Courier New" w:hAnsi="Courier New" w:cs="Courier New"/>
+          <w:noProof/>
+          <w:color w:val="000000" w:themeColor="text1"/>
+          <w:lang w:val="uk-UA"/>
+        </w:rPr>
+        <w:br/>
+        <w:t xml:space="preserve">            {</w:t>
+      </w:r>
+      <w:r>
+        <w:rPr>
+          <w:rFonts w:ascii="Courier New" w:hAnsi="Courier New" w:cs="Courier New"/>
+          <w:noProof/>
+          <w:color w:val="000000" w:themeColor="text1"/>
+          <w:lang w:val="uk-UA"/>
+        </w:rPr>
+        <w:br/>
+        <w:t xml:space="preserve">                return _instance.Value;</w:t>
+      </w:r>
+      <w:r>
+        <w:rPr>
+          <w:rFonts w:ascii="Courier New" w:hAnsi="Courier New" w:cs="Courier New"/>
+          <w:noProof/>
+          <w:color w:val="000000" w:themeColor="text1"/>
+          <w:lang w:val="uk-UA"/>
+        </w:rPr>
+        <w:br/>
+        <w:t xml:space="preserve">            }</w:t>
+      </w:r>
+      <w:r>
+        <w:rPr>
+          <w:rFonts w:ascii="Courier New" w:hAnsi="Courier New" w:cs="Courier New"/>
+          <w:noProof/>
+          <w:color w:val="000000" w:themeColor="text1"/>
+          <w:lang w:val="uk-UA"/>
+        </w:rPr>
+        <w:br/>
+        <w:t xml:space="preserve">        }</w:t>
+      </w:r>
+      <w:r>
+        <w:rPr>
+          <w:rFonts w:ascii="Courier New" w:hAnsi="Courier New" w:cs="Courier New"/>
+          <w:noProof/>
+          <w:color w:val="000000" w:themeColor="text1"/>
+          <w:lang w:val="uk-UA"/>
+        </w:rPr>
+        <w:br/>
+        <w:t xml:space="preserve">        </w:t>
+      </w:r>
+      <w:r>
+        <w:rPr>
+          <w:rFonts w:ascii="Courier New" w:hAnsi="Courier New" w:cs="Courier New"/>
+          <w:noProof/>
+          <w:color w:val="000000" w:themeColor="text1"/>
+          <w:lang w:val="uk-UA"/>
+        </w:rPr>
+        <w:br/>
+        <w:t xml:space="preserve">        private void LoadConfiguration()</w:t>
+      </w:r>
+      <w:r>
+        <w:rPr>
+          <w:rFonts w:ascii="Courier New" w:hAnsi="Courier New" w:cs="Courier New"/>
+          <w:noProof/>
+          <w:color w:val="000000" w:themeColor="text1"/>
+          <w:lang w:val="uk-UA"/>
+        </w:rPr>
+        <w:br/>
+        <w:t xml:space="preserve">        {</w:t>
+      </w:r>
+      <w:r>
+        <w:rPr>
+          <w:rFonts w:ascii="Courier New" w:hAnsi="Courier New" w:cs="Courier New"/>
+          <w:noProof/>
+          <w:color w:val="000000" w:themeColor="text1"/>
+          <w:lang w:val="uk-UA"/>
+        </w:rPr>
+        <w:br/>
+        <w:t xml:space="preserve">            try</w:t>
+      </w:r>
+      <w:r>
+        <w:rPr>
+          <w:rFonts w:ascii="Courier New" w:hAnsi="Courier New" w:cs="Courier New"/>
+          <w:noProof/>
+          <w:color w:val="000000" w:themeColor="text1"/>
+          <w:lang w:val="uk-UA"/>
+        </w:rPr>
+        <w:br/>
+        <w:t xml:space="preserve">            {</w:t>
+      </w:r>
+      <w:r>
+        <w:rPr>
+          <w:rFonts w:ascii="Courier New" w:hAnsi="Courier New" w:cs="Courier New"/>
+          <w:noProof/>
+          <w:color w:val="000000" w:themeColor="text1"/>
+          <w:lang w:val="uk-UA"/>
+        </w:rPr>
+        <w:br/>
+        <w:t xml:space="preserve">                if (File.Exists(_configFilePath))</w:t>
+      </w:r>
+      <w:r>
+        <w:rPr>
+          <w:rFonts w:ascii="Courier New" w:hAnsi="Courier New" w:cs="Courier New"/>
+          <w:noProof/>
+          <w:color w:val="000000" w:themeColor="text1"/>
+          <w:lang w:val="uk-UA"/>
+        </w:rPr>
+        <w:br/>
+        <w:t xml:space="preserve">                {</w:t>
+      </w:r>
+      <w:r>
+        <w:rPr>
+          <w:rFonts w:ascii="Courier New" w:hAnsi="Courier New" w:cs="Courier New"/>
+          <w:noProof/>
+          <w:color w:val="000000" w:themeColor="text1"/>
+          <w:lang w:val="uk-UA"/>
+        </w:rPr>
+        <w:br/>
+        <w:t xml:space="preserve">                    string json = File.ReadAllText(_configFilePath);</w:t>
+      </w:r>
+      <w:r>
+        <w:rPr>
+          <w:rFonts w:ascii="Courier New" w:hAnsi="Courier New" w:cs="Courier New"/>
+          <w:noProof/>
+          <w:color w:val="000000" w:themeColor="text1"/>
+          <w:lang w:val="uk-UA"/>
+        </w:rPr>
+        <w:br/>
+        <w:t xml:space="preserve">                    _settings = JsonSerializer.Deserialize&lt;Dictionary&lt;string, string&gt;&gt;(json) ?? new Dictionary&lt;string, string&gt;();</w:t>
+      </w:r>
+      <w:r>
+        <w:rPr>
+          <w:rFonts w:ascii="Courier New" w:hAnsi="Courier New" w:cs="Courier New"/>
+          <w:noProof/>
+          <w:color w:val="000000" w:themeColor="text1"/>
+          <w:lang w:val="uk-UA"/>
+        </w:rPr>
+        <w:br/>
+        <w:t xml:space="preserve">                    Console.WriteLine("Файл конфігурації успішно завантажено.");</w:t>
+      </w:r>
+      <w:r>
+        <w:rPr>
+          <w:rFonts w:ascii="Courier New" w:hAnsi="Courier New" w:cs="Courier New"/>
+          <w:noProof/>
+          <w:color w:val="000000" w:themeColor="text1"/>
+          <w:lang w:val="uk-UA"/>
+        </w:rPr>
+        <w:br/>
+        <w:t xml:space="preserve">                }</w:t>
+      </w:r>
+      <w:r>
+        <w:rPr>
+          <w:rFonts w:ascii="Courier New" w:hAnsi="Courier New" w:cs="Courier New"/>
+          <w:noProof/>
+          <w:color w:val="000000" w:themeColor="text1"/>
+          <w:lang w:val="uk-UA"/>
+        </w:rPr>
+        <w:br/>
+        <w:t xml:space="preserve">                else</w:t>
+      </w:r>
+      <w:r>
+        <w:rPr>
+          <w:rFonts w:ascii="Courier New" w:hAnsi="Courier New" w:cs="Courier New"/>
+          <w:noProof/>
+          <w:color w:val="000000" w:themeColor="text1"/>
+          <w:lang w:val="uk-UA"/>
+        </w:rPr>
+        <w:br/>
+        <w:t xml:space="preserve">                {</w:t>
+      </w:r>
+      <w:r>
+        <w:rPr>
+          <w:rFonts w:ascii="Courier New" w:hAnsi="Courier New" w:cs="Courier New"/>
+          <w:noProof/>
+          <w:color w:val="000000" w:themeColor="text1"/>
+          <w:lang w:val="uk-UA"/>
+        </w:rPr>
+        <w:br/>
+        <w:t xml:space="preserve">                    Console.WriteLine($"Файл конфігурації {_configFilePath} не знайдено. Будуть використані порожні налаштування.");</w:t>
+      </w:r>
+      <w:r>
+        <w:rPr>
+          <w:rFonts w:ascii="Courier New" w:hAnsi="Courier New" w:cs="Courier New"/>
+          <w:noProof/>
+          <w:color w:val="000000" w:themeColor="text1"/>
+          <w:lang w:val="uk-UA"/>
+        </w:rPr>
+        <w:br/>
+        <w:t xml:space="preserve">                }</w:t>
+      </w:r>
+      <w:r>
+        <w:rPr>
+          <w:rFonts w:ascii="Courier New" w:hAnsi="Courier New" w:cs="Courier New"/>
+          <w:noProof/>
+          <w:color w:val="000000" w:themeColor="text1"/>
+          <w:lang w:val="uk-UA"/>
+        </w:rPr>
+        <w:br/>
+        <w:t xml:space="preserve">            }</w:t>
+      </w:r>
+      <w:r>
+        <w:rPr>
+          <w:rFonts w:ascii="Courier New" w:hAnsi="Courier New" w:cs="Courier New"/>
+          <w:noProof/>
+          <w:color w:val="000000" w:themeColor="text1"/>
+          <w:lang w:val="uk-UA"/>
+        </w:rPr>
+        <w:br/>
+        <w:t xml:space="preserve">            catch (Exception ex)</w:t>
+      </w:r>
+      <w:r>
+        <w:rPr>
+          <w:rFonts w:ascii="Courier New" w:hAnsi="Courier New" w:cs="Courier New"/>
+          <w:noProof/>
+          <w:color w:val="000000" w:themeColor="text1"/>
+          <w:lang w:val="uk-UA"/>
+        </w:rPr>
+        <w:br/>
+        <w:t xml:space="preserve">            {</w:t>
+      </w:r>
+      <w:r>
+        <w:rPr>
+          <w:rFonts w:ascii="Courier New" w:hAnsi="Courier New" w:cs="Courier New"/>
+          <w:noProof/>
+          <w:color w:val="000000" w:themeColor="text1"/>
+          <w:lang w:val="uk-UA"/>
+        </w:rPr>
+        <w:br/>
+        <w:t xml:space="preserve">                Console.WriteLine($"Не вдалося завантажити конфігурацію: {ex.Message}");</w:t>
+      </w:r>
+      <w:r>
+        <w:rPr>
+          <w:rFonts w:ascii="Courier New" w:hAnsi="Courier New" w:cs="Courier New"/>
+          <w:noProof/>
+          <w:color w:val="000000" w:themeColor="text1"/>
+          <w:lang w:val="uk-UA"/>
+        </w:rPr>
+        <w:br/>
+        <w:t xml:space="preserve">            }</w:t>
+      </w:r>
+      <w:r>
+        <w:rPr>
+          <w:rFonts w:ascii="Courier New" w:hAnsi="Courier New" w:cs="Courier New"/>
+          <w:noProof/>
+          <w:color w:val="000000" w:themeColor="text1"/>
+          <w:lang w:val="uk-UA"/>
+        </w:rPr>
+        <w:br/>
+        <w:t xml:space="preserve">        }</w:t>
+      </w:r>
+      <w:r>
+        <w:rPr>
+          <w:rFonts w:ascii="Courier New" w:hAnsi="Courier New" w:cs="Courier New"/>
+          <w:noProof/>
+          <w:color w:val="000000" w:themeColor="text1"/>
+          <w:lang w:val="uk-UA"/>
+        </w:rPr>
+        <w:br/>
+        <w:t xml:space="preserve">        </w:t>
+      </w:r>
+      <w:r>
+        <w:rPr>
+          <w:rFonts w:ascii="Courier New" w:hAnsi="Courier New" w:cs="Courier New"/>
+          <w:noProof/>
+          <w:color w:val="000000" w:themeColor="text1"/>
+          <w:lang w:val="uk-UA"/>
+        </w:rPr>
+        <w:br/>
+        <w:t xml:space="preserve">        public string GetSetting(string key)</w:t>
+      </w:r>
+      <w:r>
+        <w:rPr>
+          <w:rFonts w:ascii="Courier New" w:hAnsi="Courier New" w:cs="Courier New"/>
+          <w:noProof/>
+          <w:color w:val="000000" w:themeColor="text1"/>
+          <w:lang w:val="uk-UA"/>
+        </w:rPr>
+        <w:br/>
+        <w:t xml:space="preserve">        {</w:t>
+      </w:r>
+      <w:r>
+        <w:rPr>
+          <w:rFonts w:ascii="Courier New" w:hAnsi="Courier New" w:cs="Courier New"/>
+          <w:noProof/>
+          <w:color w:val="000000" w:themeColor="text1"/>
+          <w:lang w:val="uk-UA"/>
+        </w:rPr>
+        <w:br/>
+        <w:t xml:space="preserve">            if (_settings.TryGetValue(key, out string value))</w:t>
+      </w:r>
+      <w:r>
+        <w:rPr>
+          <w:rFonts w:ascii="Courier New" w:hAnsi="Courier New" w:cs="Courier New"/>
+          <w:noProof/>
+          <w:color w:val="000000" w:themeColor="text1"/>
+          <w:lang w:val="uk-UA"/>
+        </w:rPr>
+        <w:br/>
+        <w:t xml:space="preserve">            {</w:t>
+      </w:r>
+      <w:r>
+        <w:rPr>
+          <w:rFonts w:ascii="Courier New" w:hAnsi="Courier New" w:cs="Courier New"/>
+          <w:noProof/>
+          <w:color w:val="000000" w:themeColor="text1"/>
+          <w:lang w:val="uk-UA"/>
+        </w:rPr>
+        <w:br/>
+        <w:t xml:space="preserve">                return value;</w:t>
+      </w:r>
+      <w:r>
+        <w:rPr>
+          <w:rFonts w:ascii="Courier New" w:hAnsi="Courier New" w:cs="Courier New"/>
+          <w:noProof/>
+          <w:color w:val="000000" w:themeColor="text1"/>
+          <w:lang w:val="uk-UA"/>
+        </w:rPr>
+        <w:br/>
+        <w:t xml:space="preserve">            }</w:t>
+      </w:r>
+      <w:r>
+        <w:rPr>
+          <w:rFonts w:ascii="Courier New" w:hAnsi="Courier New" w:cs="Courier New"/>
+          <w:noProof/>
+          <w:color w:val="000000" w:themeColor="text1"/>
+          <w:lang w:val="uk-UA"/>
+        </w:rPr>
+        <w:br/>
+      </w:r>
+      <w:r>
+        <w:rPr>
+          <w:rFonts w:ascii="Courier New" w:hAnsi="Courier New" w:cs="Courier New"/>
+          <w:noProof/>
+          <w:color w:val="000000" w:themeColor="text1"/>
+          <w:lang w:val="uk-UA"/>
+        </w:rPr>
+        <w:br/>
+        <w:t xml:space="preserve">            return null;</w:t>
+      </w:r>
+      <w:r>
+        <w:rPr>
+          <w:rFonts w:ascii="Courier New" w:hAnsi="Courier New" w:cs="Courier New"/>
+          <w:noProof/>
+          <w:color w:val="000000" w:themeColor="text1"/>
+          <w:lang w:val="uk-UA"/>
+        </w:rPr>
+        <w:br/>
+        <w:t xml:space="preserve">        }</w:t>
+      </w:r>
+      <w:r>
+        <w:rPr>
+          <w:rFonts w:ascii="Courier New" w:hAnsi="Courier New" w:cs="Courier New"/>
+          <w:noProof/>
+          <w:color w:val="000000" w:themeColor="text1"/>
+          <w:lang w:val="uk-UA"/>
+        </w:rPr>
+        <w:br/>
+        <w:t xml:space="preserve">    }</w:t>
       </w:r>
       <w:r>
         <w:rPr>
@@ -3866,7 +4179,7 @@
           <w:noProof/>
           <w:sz w:val="28"/>
           <w:szCs w:val="28"/>
-          <w:lang w:val="uk-UA"/>
+          <w:lang w:val="en-US"/>
         </w:rPr>
       </w:pPr>
     </w:p>
@@ -3888,7 +4201,7 @@
           <w:szCs w:val="28"/>
           <w:lang w:val="uk-UA"/>
         </w:rPr>
-        <w:t>IButton.cs</w:t>
+        <w:t>Program.cs</w:t>
       </w:r>
     </w:p>
     <w:p>
@@ -3917,36 +4230,17 @@
           <w:rFonts w:ascii="Courier New" w:hAnsi="Courier New" w:cs="Courier New"/>
           <w:noProof/>
           <w:color w:val="000000" w:themeColor="text1"/>
-          <w:lang w:val="uk-UA"/>
-        </w:rPr>
-      </w:pPr>
-      <w:r>
-        <w:rPr>
-          <w:rFonts w:ascii="Courier New" w:hAnsi="Courier New" w:cs="Courier New"/>
-          <w:noProof/>
-          <w:color w:val="000000" w:themeColor="text1"/>
-          <w:lang w:val="uk-UA"/>
-        </w:rPr>
-        <w:t>namespace abstract_factory;</w:t>
-      </w:r>
-      <w:r>
-        <w:rPr>
-          <w:rFonts w:ascii="Courier New" w:hAnsi="Courier New" w:cs="Courier New"/>
-          <w:noProof/>
-          <w:color w:val="000000" w:themeColor="text1"/>
-          <w:lang w:val="uk-UA"/>
-        </w:rPr>
-        <w:br/>
-      </w:r>
-      <w:r>
-        <w:rPr>
-          <w:rFonts w:ascii="Courier New" w:hAnsi="Courier New" w:cs="Courier New"/>
-          <w:noProof/>
-          <w:color w:val="000000" w:themeColor="text1"/>
-          <w:lang w:val="uk-UA"/>
-        </w:rPr>
-        <w:br/>
-        <w:t>public interface IButton</w:t>
+          <w:lang w:val="en-US"/>
+        </w:rPr>
+      </w:pPr>
+      <w:r>
+        <w:rPr>
+          <w:rFonts w:ascii="Courier New" w:hAnsi="Courier New" w:cs="Courier New"/>
+          <w:noProof/>
+          <w:color w:val="000000" w:themeColor="text1"/>
+          <w:lang w:val="uk-UA"/>
+        </w:rPr>
+        <w:t>namespace singleton</w:t>
       </w:r>
       <w:r>
         <w:rPr>
@@ -3966,17 +4260,442 @@
           <w:lang w:val="uk-UA"/>
         </w:rPr>
         <w:br/>
-        <w:t xml:space="preserve">    void Render();</w:t>
-      </w:r>
-      <w:r>
-        <w:rPr>
-          <w:rFonts w:ascii="Courier New" w:hAnsi="Courier New" w:cs="Courier New"/>
-          <w:noProof/>
-          <w:color w:val="000000" w:themeColor="text1"/>
-          <w:lang w:val="uk-UA"/>
-        </w:rPr>
-        <w:br/>
-        <w:t xml:space="preserve">    void OnClick();</w:t>
+        <w:t xml:space="preserve">    public class Program</w:t>
+      </w:r>
+      <w:r>
+        <w:rPr>
+          <w:rFonts w:ascii="Courier New" w:hAnsi="Courier New" w:cs="Courier New"/>
+          <w:noProof/>
+          <w:color w:val="000000" w:themeColor="text1"/>
+          <w:lang w:val="uk-UA"/>
+        </w:rPr>
+        <w:br/>
+        <w:t xml:space="preserve">    {</w:t>
+      </w:r>
+      <w:r>
+        <w:rPr>
+          <w:rFonts w:ascii="Courier New" w:hAnsi="Courier New" w:cs="Courier New"/>
+          <w:noProof/>
+          <w:color w:val="000000" w:themeColor="text1"/>
+          <w:lang w:val="uk-UA"/>
+        </w:rPr>
+        <w:br/>
+        <w:t xml:space="preserve">        public static void Main(string[] args)</w:t>
+      </w:r>
+      <w:r>
+        <w:rPr>
+          <w:rFonts w:ascii="Courier New" w:hAnsi="Courier New" w:cs="Courier New"/>
+          <w:noProof/>
+          <w:color w:val="000000" w:themeColor="text1"/>
+          <w:lang w:val="uk-UA"/>
+        </w:rPr>
+        <w:br/>
+        <w:t xml:space="preserve">        {</w:t>
+      </w:r>
+      <w:r>
+        <w:rPr>
+          <w:rFonts w:ascii="Courier New" w:hAnsi="Courier New" w:cs="Courier New"/>
+          <w:noProof/>
+          <w:color w:val="000000" w:themeColor="text1"/>
+          <w:lang w:val="uk-UA"/>
+        </w:rPr>
+        <w:br/>
+        <w:t xml:space="preserve">            Console.OutputEncoding = System.Text.Encoding.UTF8;</w:t>
+      </w:r>
+      <w:r>
+        <w:rPr>
+          <w:rFonts w:ascii="Courier New" w:hAnsi="Courier New" w:cs="Courier New"/>
+          <w:noProof/>
+          <w:color w:val="000000" w:themeColor="text1"/>
+          <w:lang w:val="uk-UA"/>
+        </w:rPr>
+        <w:br/>
+        <w:t xml:space="preserve">            CreateDummyConfigFile();</w:t>
+      </w:r>
+      <w:r>
+        <w:rPr>
+          <w:rFonts w:ascii="Courier New" w:hAnsi="Courier New" w:cs="Courier New"/>
+          <w:noProof/>
+          <w:color w:val="000000" w:themeColor="text1"/>
+          <w:lang w:val="uk-UA"/>
+        </w:rPr>
+        <w:br/>
+      </w:r>
+      <w:r>
+        <w:rPr>
+          <w:rFonts w:ascii="Courier New" w:hAnsi="Courier New" w:cs="Courier New"/>
+          <w:noProof/>
+          <w:color w:val="000000" w:themeColor="text1"/>
+          <w:lang w:val="uk-UA"/>
+        </w:rPr>
+        <w:br/>
+        <w:t xml:space="preserve">            Console.WriteLine("Звернення до ConfigurationManager.Instance (Екземпляр 1)...");</w:t>
+      </w:r>
+      <w:r>
+        <w:rPr>
+          <w:rFonts w:ascii="Courier New" w:hAnsi="Courier New" w:cs="Courier New"/>
+          <w:noProof/>
+          <w:color w:val="000000" w:themeColor="text1"/>
+          <w:lang w:val="uk-UA"/>
+        </w:rPr>
+        <w:br/>
+        <w:t xml:space="preserve">            ConfigurationManager config1 = ConfigurationManager.Instance;</w:t>
+      </w:r>
+      <w:r>
+        <w:rPr>
+          <w:rFonts w:ascii="Courier New" w:hAnsi="Courier New" w:cs="Courier New"/>
+          <w:noProof/>
+          <w:color w:val="000000" w:themeColor="text1"/>
+          <w:lang w:val="uk-UA"/>
+        </w:rPr>
+        <w:br/>
+        <w:t xml:space="preserve">            Console.WriteLine($"Налаштування 'Theme': {config1.GetSetting("Theme")}");</w:t>
+      </w:r>
+      <w:r>
+        <w:rPr>
+          <w:rFonts w:ascii="Courier New" w:hAnsi="Courier New" w:cs="Courier New"/>
+          <w:noProof/>
+          <w:color w:val="000000" w:themeColor="text1"/>
+          <w:lang w:val="uk-UA"/>
+        </w:rPr>
+        <w:br/>
+        <w:t xml:space="preserve">            Console.WriteLine($"Налаштування 'Language': {config1.GetSetting("Language")}");</w:t>
+      </w:r>
+      <w:r>
+        <w:rPr>
+          <w:rFonts w:ascii="Courier New" w:hAnsi="Courier New" w:cs="Courier New"/>
+          <w:noProof/>
+          <w:color w:val="000000" w:themeColor="text1"/>
+          <w:lang w:val="uk-UA"/>
+        </w:rPr>
+        <w:br/>
+      </w:r>
+      <w:r>
+        <w:rPr>
+          <w:rFonts w:ascii="Courier New" w:hAnsi="Courier New" w:cs="Courier New"/>
+          <w:noProof/>
+          <w:color w:val="000000" w:themeColor="text1"/>
+          <w:lang w:val="uk-UA"/>
+        </w:rPr>
+        <w:br/>
+        <w:t xml:space="preserve">            Console.WriteLine("\nЗвернення до ConfigurationManager.Instance </w:t>
+      </w:r>
+      <w:r>
+        <w:rPr>
+          <w:rFonts w:ascii="Courier New" w:hAnsi="Courier New" w:cs="Courier New"/>
+          <w:noProof/>
+          <w:color w:val="000000" w:themeColor="text1"/>
+          <w:lang w:val="uk-UA"/>
+        </w:rPr>
+        <w:lastRenderedPageBreak/>
+        <w:t>(Екземпляр 2)...");</w:t>
+      </w:r>
+      <w:r>
+        <w:rPr>
+          <w:rFonts w:ascii="Courier New" w:hAnsi="Courier New" w:cs="Courier New"/>
+          <w:noProof/>
+          <w:color w:val="000000" w:themeColor="text1"/>
+          <w:lang w:val="uk-UA"/>
+        </w:rPr>
+        <w:br/>
+        <w:t xml:space="preserve">            ConfigurationManager config2 = ConfigurationManager.Instance;</w:t>
+      </w:r>
+      <w:r>
+        <w:rPr>
+          <w:rFonts w:ascii="Courier New" w:hAnsi="Courier New" w:cs="Courier New"/>
+          <w:noProof/>
+          <w:color w:val="000000" w:themeColor="text1"/>
+          <w:lang w:val="uk-UA"/>
+        </w:rPr>
+        <w:br/>
+        <w:t xml:space="preserve">            Console.WriteLine($"Налаштування 'MaxConnections': {config2.GetSetting("MaxConnections")}");</w:t>
+      </w:r>
+      <w:r>
+        <w:rPr>
+          <w:rFonts w:ascii="Courier New" w:hAnsi="Courier New" w:cs="Courier New"/>
+          <w:noProof/>
+          <w:color w:val="000000" w:themeColor="text1"/>
+          <w:lang w:val="uk-UA"/>
+        </w:rPr>
+        <w:br/>
+        <w:t xml:space="preserve">            Console.WriteLine("\n--- Перевірка на ідентичність ---");</w:t>
+      </w:r>
+      <w:r>
+        <w:rPr>
+          <w:rFonts w:ascii="Courier New" w:hAnsi="Courier New" w:cs="Courier New"/>
+          <w:noProof/>
+          <w:color w:val="000000" w:themeColor="text1"/>
+          <w:lang w:val="uk-UA"/>
+        </w:rPr>
+        <w:br/>
+      </w:r>
+      <w:r>
+        <w:rPr>
+          <w:rFonts w:ascii="Courier New" w:hAnsi="Courier New" w:cs="Courier New"/>
+          <w:noProof/>
+          <w:color w:val="000000" w:themeColor="text1"/>
+          <w:lang w:val="uk-UA"/>
+        </w:rPr>
+        <w:br/>
+        <w:t xml:space="preserve">            if (ReferenceEquals(config1, config2))</w:t>
+      </w:r>
+      <w:r>
+        <w:rPr>
+          <w:rFonts w:ascii="Courier New" w:hAnsi="Courier New" w:cs="Courier New"/>
+          <w:noProof/>
+          <w:color w:val="000000" w:themeColor="text1"/>
+          <w:lang w:val="uk-UA"/>
+        </w:rPr>
+        <w:br/>
+        <w:t xml:space="preserve">            {</w:t>
+      </w:r>
+      <w:r>
+        <w:rPr>
+          <w:rFonts w:ascii="Courier New" w:hAnsi="Courier New" w:cs="Courier New"/>
+          <w:noProof/>
+          <w:color w:val="000000" w:themeColor="text1"/>
+          <w:lang w:val="uk-UA"/>
+        </w:rPr>
+        <w:br/>
+        <w:t xml:space="preserve">                Console.WriteLine("config1 та config2 є посиланнями на один і той самий екземпляр.");</w:t>
+      </w:r>
+      <w:r>
+        <w:rPr>
+          <w:rFonts w:ascii="Courier New" w:hAnsi="Courier New" w:cs="Courier New"/>
+          <w:noProof/>
+          <w:color w:val="000000" w:themeColor="text1"/>
+          <w:lang w:val="uk-UA"/>
+        </w:rPr>
+        <w:br/>
+        <w:t xml:space="preserve">                Console.WriteLine("Патерн Singleton працює коректно.");</w:t>
+      </w:r>
+      <w:r>
+        <w:rPr>
+          <w:rFonts w:ascii="Courier New" w:hAnsi="Courier New" w:cs="Courier New"/>
+          <w:noProof/>
+          <w:color w:val="000000" w:themeColor="text1"/>
+          <w:lang w:val="uk-UA"/>
+        </w:rPr>
+        <w:br/>
+        <w:t xml:space="preserve">            }</w:t>
+      </w:r>
+      <w:r>
+        <w:rPr>
+          <w:rFonts w:ascii="Courier New" w:hAnsi="Courier New" w:cs="Courier New"/>
+          <w:noProof/>
+          <w:color w:val="000000" w:themeColor="text1"/>
+          <w:lang w:val="uk-UA"/>
+        </w:rPr>
+        <w:br/>
+        <w:t xml:space="preserve">            else</w:t>
+      </w:r>
+      <w:r>
+        <w:rPr>
+          <w:rFonts w:ascii="Courier New" w:hAnsi="Courier New" w:cs="Courier New"/>
+          <w:noProof/>
+          <w:color w:val="000000" w:themeColor="text1"/>
+          <w:lang w:val="uk-UA"/>
+        </w:rPr>
+        <w:br/>
+        <w:t xml:space="preserve">            {</w:t>
+      </w:r>
+      <w:r>
+        <w:rPr>
+          <w:rFonts w:ascii="Courier New" w:hAnsi="Courier New" w:cs="Courier New"/>
+          <w:noProof/>
+          <w:color w:val="000000" w:themeColor="text1"/>
+          <w:lang w:val="uk-UA"/>
+        </w:rPr>
+        <w:br/>
+        <w:t xml:space="preserve">                Console.WriteLine("Створено різні екземпляри.");</w:t>
+      </w:r>
+      <w:r>
+        <w:rPr>
+          <w:rFonts w:ascii="Courier New" w:hAnsi="Courier New" w:cs="Courier New"/>
+          <w:noProof/>
+          <w:color w:val="000000" w:themeColor="text1"/>
+          <w:lang w:val="uk-UA"/>
+        </w:rPr>
+        <w:br/>
+        <w:t xml:space="preserve">            }</w:t>
+      </w:r>
+      <w:r>
+        <w:rPr>
+          <w:rFonts w:ascii="Courier New" w:hAnsi="Courier New" w:cs="Courier New"/>
+          <w:noProof/>
+          <w:color w:val="000000" w:themeColor="text1"/>
+          <w:lang w:val="uk-UA"/>
+        </w:rPr>
+        <w:br/>
+        <w:t xml:space="preserve">        }</w:t>
+      </w:r>
+      <w:r>
+        <w:rPr>
+          <w:rFonts w:ascii="Courier New" w:hAnsi="Courier New" w:cs="Courier New"/>
+          <w:noProof/>
+          <w:color w:val="000000" w:themeColor="text1"/>
+          <w:lang w:val="uk-UA"/>
+        </w:rPr>
+        <w:br/>
+      </w:r>
+      <w:r>
+        <w:rPr>
+          <w:rFonts w:ascii="Courier New" w:hAnsi="Courier New" w:cs="Courier New"/>
+          <w:noProof/>
+          <w:color w:val="000000" w:themeColor="text1"/>
+          <w:lang w:val="uk-UA"/>
+        </w:rPr>
+        <w:br/>
+        <w:t xml:space="preserve">        private static void CreateDummyConfigFile()</w:t>
+      </w:r>
+      <w:r>
+        <w:rPr>
+          <w:rFonts w:ascii="Courier New" w:hAnsi="Courier New" w:cs="Courier New"/>
+          <w:noProof/>
+          <w:color w:val="000000" w:themeColor="text1"/>
+          <w:lang w:val="uk-UA"/>
+        </w:rPr>
+        <w:br/>
+        <w:t xml:space="preserve">        {</w:t>
+      </w:r>
+      <w:r>
+        <w:rPr>
+          <w:rFonts w:ascii="Courier New" w:hAnsi="Courier New" w:cs="Courier New"/>
+          <w:noProof/>
+          <w:color w:val="000000" w:themeColor="text1"/>
+          <w:lang w:val="uk-UA"/>
+        </w:rPr>
+        <w:br/>
+        <w:t xml:space="preserve">            string filePath = "config.json";</w:t>
+      </w:r>
+      <w:r>
+        <w:rPr>
+          <w:rFonts w:ascii="Courier New" w:hAnsi="Courier New" w:cs="Courier New"/>
+          <w:noProof/>
+          <w:color w:val="000000" w:themeColor="text1"/>
+          <w:lang w:val="uk-UA"/>
+        </w:rPr>
+        <w:br/>
+      </w:r>
+      <w:r>
+        <w:rPr>
+          <w:rFonts w:ascii="Courier New" w:hAnsi="Courier New" w:cs="Courier New"/>
+          <w:noProof/>
+          <w:color w:val="000000" w:themeColor="text1"/>
+          <w:lang w:val="uk-UA"/>
+        </w:rPr>
+        <w:br/>
+        <w:t xml:space="preserve">            if (!File.Exists(filePath))</w:t>
+      </w:r>
+      <w:r>
+        <w:rPr>
+          <w:rFonts w:ascii="Courier New" w:hAnsi="Courier New" w:cs="Courier New"/>
+          <w:noProof/>
+          <w:color w:val="000000" w:themeColor="text1"/>
+          <w:lang w:val="uk-UA"/>
+        </w:rPr>
+        <w:br/>
+        <w:t xml:space="preserve">            {</w:t>
+      </w:r>
+      <w:r>
+        <w:rPr>
+          <w:rFonts w:ascii="Courier New" w:hAnsi="Courier New" w:cs="Courier New"/>
+          <w:noProof/>
+          <w:color w:val="000000" w:themeColor="text1"/>
+          <w:lang w:val="uk-UA"/>
+        </w:rPr>
+        <w:br/>
+        <w:t xml:space="preserve">                string jsonContent = @"{</w:t>
+      </w:r>
+      <w:r>
+        <w:rPr>
+          <w:rFonts w:ascii="Courier New" w:hAnsi="Courier New" w:cs="Courier New"/>
+          <w:noProof/>
+          <w:color w:val="000000" w:themeColor="text1"/>
+          <w:lang w:val="uk-UA"/>
+        </w:rPr>
+        <w:br/>
+        <w:t xml:space="preserve">                    ""Theme"": ""Dark"",</w:t>
+      </w:r>
+      <w:r>
+        <w:rPr>
+          <w:rFonts w:ascii="Courier New" w:hAnsi="Courier New" w:cs="Courier New"/>
+          <w:noProof/>
+          <w:color w:val="000000" w:themeColor="text1"/>
+          <w:lang w:val="uk-UA"/>
+        </w:rPr>
+        <w:br/>
+        <w:t xml:space="preserve">                    ""Language"": ""uk-UA"",</w:t>
+      </w:r>
+      <w:r>
+        <w:rPr>
+          <w:rFonts w:ascii="Courier New" w:hAnsi="Courier New" w:cs="Courier New"/>
+          <w:noProof/>
+          <w:color w:val="000000" w:themeColor="text1"/>
+          <w:lang w:val="uk-UA"/>
+        </w:rPr>
+        <w:br/>
+        <w:t xml:space="preserve">                    ""MaxConnections"": ""100"",</w:t>
+      </w:r>
+      <w:r>
+        <w:rPr>
+          <w:rFonts w:ascii="Courier New" w:hAnsi="Courier New" w:cs="Courier New"/>
+          <w:noProof/>
+          <w:color w:val="000000" w:themeColor="text1"/>
+          <w:lang w:val="uk-UA"/>
+        </w:rPr>
+        <w:br/>
+        <w:t xml:space="preserve">                    ""ApiUrl"": ""https://api.example.com/v1""</w:t>
+      </w:r>
+      <w:r>
+        <w:rPr>
+          <w:rFonts w:ascii="Courier New" w:hAnsi="Courier New" w:cs="Courier New"/>
+          <w:noProof/>
+          <w:color w:val="000000" w:themeColor="text1"/>
+          <w:lang w:val="uk-UA"/>
+        </w:rPr>
+        <w:br/>
+        <w:t xml:space="preserve">                }";</w:t>
+      </w:r>
+      <w:r>
+        <w:rPr>
+          <w:rFonts w:ascii="Courier New" w:hAnsi="Courier New" w:cs="Courier New"/>
+          <w:noProof/>
+          <w:color w:val="000000" w:themeColor="text1"/>
+          <w:lang w:val="uk-UA"/>
+        </w:rPr>
+        <w:br/>
+        <w:t xml:space="preserve">                File.WriteAllText(filePath, jsonContent);</w:t>
+      </w:r>
+      <w:r>
+        <w:rPr>
+          <w:rFonts w:ascii="Courier New" w:hAnsi="Courier New" w:cs="Courier New"/>
+          <w:noProof/>
+          <w:color w:val="000000" w:themeColor="text1"/>
+          <w:lang w:val="uk-UA"/>
+        </w:rPr>
+        <w:br/>
+        <w:t xml:space="preserve">            }</w:t>
+      </w:r>
+      <w:r>
+        <w:rPr>
+          <w:rFonts w:ascii="Courier New" w:hAnsi="Courier New" w:cs="Courier New"/>
+          <w:noProof/>
+          <w:color w:val="000000" w:themeColor="text1"/>
+          <w:lang w:val="uk-UA"/>
+        </w:rPr>
+        <w:br/>
+        <w:t xml:space="preserve">        }</w:t>
+      </w:r>
+      <w:r>
+        <w:rPr>
+          <w:rFonts w:ascii="Courier New" w:hAnsi="Courier New" w:cs="Courier New"/>
+          <w:noProof/>
+          <w:color w:val="000000" w:themeColor="text1"/>
+          <w:lang w:val="uk-UA"/>
+        </w:rPr>
+        <w:br/>
+        <w:t xml:space="preserve">    }</w:t>
       </w:r>
       <w:r>
         <w:rPr>
@@ -3999,6 +4718,27 @@
           <w:lang w:val="uk-UA"/>
         </w:rPr>
       </w:pPr>
+    </w:p>
+    <w:p>
+      <w:pPr>
+        <w:spacing w:line="360" w:lineRule="auto"/>
+        <w:ind w:firstLine="709"/>
+        <w:rPr>
+          <w:noProof/>
+          <w:sz w:val="28"/>
+          <w:szCs w:val="28"/>
+          <w:lang w:val="uk-UA"/>
+        </w:rPr>
+      </w:pPr>
+      <w:r>
+        <w:rPr>
+          <w:noProof/>
+          <w:sz w:val="28"/>
+          <w:szCs w:val="28"/>
+          <w:lang w:val="uk-UA"/>
+        </w:rPr>
+        <w:t>При запуску програми в консоль виводиться наступний результат:</w:t>
+      </w:r>
     </w:p>
     <w:p>
       <w:pPr>
@@ -4008,2204 +4748,7 @@
           <w:noProof/>
           <w:sz w:val="28"/>
           <w:szCs w:val="28"/>
-          <w:lang w:val="uk-UA"/>
-        </w:rPr>
-      </w:pPr>
-      <w:r>
-        <w:rPr>
-          <w:noProof/>
-          <w:sz w:val="28"/>
-          <w:szCs w:val="28"/>
-          <w:lang w:val="uk-UA"/>
-        </w:rPr>
-        <w:t>ICheckbox.cs</w:t>
-      </w:r>
-    </w:p>
-    <w:p>
-      <w:pPr>
-        <w:widowControl/>
-        <w:tabs>
-          <w:tab w:val="left" w:pos="916"/>
-          <w:tab w:val="left" w:pos="1832"/>
-          <w:tab w:val="left" w:pos="2748"/>
-          <w:tab w:val="left" w:pos="3664"/>
-          <w:tab w:val="left" w:pos="4580"/>
-          <w:tab w:val="left" w:pos="5496"/>
-          <w:tab w:val="left" w:pos="6412"/>
-          <w:tab w:val="left" w:pos="7328"/>
-          <w:tab w:val="left" w:pos="8244"/>
-          <w:tab w:val="left" w:pos="9160"/>
-          <w:tab w:val="left" w:pos="10076"/>
-          <w:tab w:val="left" w:pos="10992"/>
-          <w:tab w:val="left" w:pos="11908"/>
-          <w:tab w:val="left" w:pos="12824"/>
-          <w:tab w:val="left" w:pos="13740"/>
-          <w:tab w:val="left" w:pos="14656"/>
-        </w:tabs>
-        <w:spacing w:line="240" w:lineRule="auto"/>
-        <w:rPr>
-          <w:rFonts w:ascii="Courier New" w:hAnsi="Courier New" w:cs="Courier New"/>
-          <w:noProof/>
-          <w:color w:val="000000" w:themeColor="text1"/>
-          <w:lang w:val="uk-UA"/>
-        </w:rPr>
-      </w:pPr>
-      <w:r>
-        <w:rPr>
-          <w:rFonts w:ascii="Courier New" w:hAnsi="Courier New" w:cs="Courier New"/>
-          <w:noProof/>
-          <w:color w:val="000000" w:themeColor="text1"/>
-          <w:lang w:val="uk-UA"/>
-        </w:rPr>
-        <w:t>namespace abstract_factory;</w:t>
-      </w:r>
-      <w:r>
-        <w:rPr>
-          <w:rFonts w:ascii="Courier New" w:hAnsi="Courier New" w:cs="Courier New"/>
-          <w:noProof/>
-          <w:color w:val="000000" w:themeColor="text1"/>
-          <w:lang w:val="uk-UA"/>
-        </w:rPr>
-        <w:br/>
-      </w:r>
-      <w:r>
-        <w:rPr>
-          <w:rFonts w:ascii="Courier New" w:hAnsi="Courier New" w:cs="Courier New"/>
-          <w:noProof/>
-          <w:color w:val="000000" w:themeColor="text1"/>
-          <w:lang w:val="uk-UA"/>
-        </w:rPr>
-        <w:br/>
-        <w:t>public interface ICheckbox</w:t>
-      </w:r>
-      <w:r>
-        <w:rPr>
-          <w:rFonts w:ascii="Courier New" w:hAnsi="Courier New" w:cs="Courier New"/>
-          <w:noProof/>
-          <w:color w:val="000000" w:themeColor="text1"/>
-          <w:lang w:val="uk-UA"/>
-        </w:rPr>
-        <w:br/>
-        <w:t>{</w:t>
-      </w:r>
-      <w:r>
-        <w:rPr>
-          <w:rFonts w:ascii="Courier New" w:hAnsi="Courier New" w:cs="Courier New"/>
-          <w:noProof/>
-          <w:color w:val="000000" w:themeColor="text1"/>
-          <w:lang w:val="uk-UA"/>
-        </w:rPr>
-        <w:br/>
-        <w:t xml:space="preserve">    void Render();</w:t>
-      </w:r>
-      <w:r>
-        <w:rPr>
-          <w:rFonts w:ascii="Courier New" w:hAnsi="Courier New" w:cs="Courier New"/>
-          <w:noProof/>
-          <w:color w:val="000000" w:themeColor="text1"/>
-          <w:lang w:val="uk-UA"/>
-        </w:rPr>
-        <w:br/>
-        <w:t xml:space="preserve">    void OnClick();</w:t>
-      </w:r>
-      <w:r>
-        <w:rPr>
-          <w:rFonts w:ascii="Courier New" w:hAnsi="Courier New" w:cs="Courier New"/>
-          <w:noProof/>
-          <w:color w:val="000000" w:themeColor="text1"/>
-          <w:lang w:val="uk-UA"/>
-        </w:rPr>
-        <w:br/>
-        <w:t>}</w:t>
-      </w:r>
-    </w:p>
-    <w:p>
-      <w:pPr>
-        <w:spacing w:line="360" w:lineRule="auto"/>
-        <w:rPr>
-          <w:noProof/>
-          <w:sz w:val="28"/>
-          <w:szCs w:val="28"/>
-          <w:lang w:val="uk-UA"/>
-        </w:rPr>
-      </w:pPr>
-    </w:p>
-    <w:p>
-      <w:pPr>
-        <w:spacing w:line="360" w:lineRule="auto"/>
-        <w:jc w:val="center"/>
-        <w:rPr>
-          <w:noProof/>
-          <w:sz w:val="28"/>
-          <w:szCs w:val="28"/>
-          <w:lang w:val="uk-UA"/>
-        </w:rPr>
-      </w:pPr>
-      <w:r>
-        <w:rPr>
-          <w:noProof/>
-          <w:sz w:val="28"/>
-          <w:szCs w:val="28"/>
-          <w:lang w:val="uk-UA"/>
-        </w:rPr>
-        <w:t>WindowsFactory.cs</w:t>
-      </w:r>
-    </w:p>
-    <w:p>
-      <w:pPr>
-        <w:widowControl/>
-        <w:tabs>
-          <w:tab w:val="left" w:pos="916"/>
-          <w:tab w:val="left" w:pos="1832"/>
-          <w:tab w:val="left" w:pos="2748"/>
-          <w:tab w:val="left" w:pos="3664"/>
-          <w:tab w:val="left" w:pos="4580"/>
-          <w:tab w:val="left" w:pos="5496"/>
-          <w:tab w:val="left" w:pos="6412"/>
-          <w:tab w:val="left" w:pos="7328"/>
-          <w:tab w:val="left" w:pos="8244"/>
-          <w:tab w:val="left" w:pos="9160"/>
-          <w:tab w:val="left" w:pos="10076"/>
-          <w:tab w:val="left" w:pos="10992"/>
-          <w:tab w:val="left" w:pos="11908"/>
-          <w:tab w:val="left" w:pos="12824"/>
-          <w:tab w:val="left" w:pos="13740"/>
-          <w:tab w:val="left" w:pos="14656"/>
-        </w:tabs>
-        <w:spacing w:line="240" w:lineRule="auto"/>
-        <w:rPr>
-          <w:rFonts w:ascii="Courier New" w:hAnsi="Courier New" w:cs="Courier New"/>
-          <w:noProof/>
-          <w:color w:val="000000" w:themeColor="text1"/>
-          <w:lang w:val="uk-UA"/>
-        </w:rPr>
-      </w:pPr>
-      <w:r>
-        <w:rPr>
-          <w:rFonts w:ascii="Courier New" w:hAnsi="Courier New" w:cs="Courier New"/>
-          <w:noProof/>
-          <w:color w:val="000000" w:themeColor="text1"/>
-          <w:lang w:val="uk-UA"/>
-        </w:rPr>
-        <w:t>namespace abstract_factory;</w:t>
-      </w:r>
-      <w:r>
-        <w:rPr>
-          <w:rFonts w:ascii="Courier New" w:hAnsi="Courier New" w:cs="Courier New"/>
-          <w:noProof/>
-          <w:color w:val="000000" w:themeColor="text1"/>
-          <w:lang w:val="uk-UA"/>
-        </w:rPr>
-        <w:br/>
-      </w:r>
-      <w:r>
-        <w:rPr>
-          <w:rFonts w:ascii="Courier New" w:hAnsi="Courier New" w:cs="Courier New"/>
-          <w:noProof/>
-          <w:color w:val="000000" w:themeColor="text1"/>
-          <w:lang w:val="uk-UA"/>
-        </w:rPr>
-        <w:br/>
-        <w:t>public class WindowsFactory : IUIFactory</w:t>
-      </w:r>
-      <w:r>
-        <w:rPr>
-          <w:rFonts w:ascii="Courier New" w:hAnsi="Courier New" w:cs="Courier New"/>
-          <w:noProof/>
-          <w:color w:val="000000" w:themeColor="text1"/>
-          <w:lang w:val="uk-UA"/>
-        </w:rPr>
-        <w:br/>
-        <w:t>{</w:t>
-      </w:r>
-      <w:r>
-        <w:rPr>
-          <w:rFonts w:ascii="Courier New" w:hAnsi="Courier New" w:cs="Courier New"/>
-          <w:noProof/>
-          <w:color w:val="000000" w:themeColor="text1"/>
-          <w:lang w:val="uk-UA"/>
-        </w:rPr>
-        <w:br/>
-        <w:t xml:space="preserve">    public IButton CreateButton()</w:t>
-      </w:r>
-      <w:r>
-        <w:rPr>
-          <w:rFonts w:ascii="Courier New" w:hAnsi="Courier New" w:cs="Courier New"/>
-          <w:noProof/>
-          <w:color w:val="000000" w:themeColor="text1"/>
-          <w:lang w:val="uk-UA"/>
-        </w:rPr>
-        <w:br/>
-        <w:t xml:space="preserve">    {</w:t>
-      </w:r>
-      <w:r>
-        <w:rPr>
-          <w:rFonts w:ascii="Courier New" w:hAnsi="Courier New" w:cs="Courier New"/>
-          <w:noProof/>
-          <w:color w:val="000000" w:themeColor="text1"/>
-          <w:lang w:val="uk-UA"/>
-        </w:rPr>
-        <w:br/>
-        <w:t xml:space="preserve">        return new WindowsButton();</w:t>
-      </w:r>
-      <w:r>
-        <w:rPr>
-          <w:rFonts w:ascii="Courier New" w:hAnsi="Courier New" w:cs="Courier New"/>
-          <w:noProof/>
-          <w:color w:val="000000" w:themeColor="text1"/>
-          <w:lang w:val="uk-UA"/>
-        </w:rPr>
-        <w:br/>
-        <w:t xml:space="preserve">    }</w:t>
-      </w:r>
-      <w:r>
-        <w:rPr>
-          <w:rFonts w:ascii="Courier New" w:hAnsi="Courier New" w:cs="Courier New"/>
-          <w:noProof/>
-          <w:color w:val="000000" w:themeColor="text1"/>
-          <w:lang w:val="uk-UA"/>
-        </w:rPr>
-        <w:br/>
-      </w:r>
-      <w:r>
-        <w:rPr>
-          <w:rFonts w:ascii="Courier New" w:hAnsi="Courier New" w:cs="Courier New"/>
-          <w:noProof/>
-          <w:color w:val="000000" w:themeColor="text1"/>
-          <w:lang w:val="uk-UA"/>
-        </w:rPr>
-        <w:br/>
-        <w:t xml:space="preserve">    public ICheckbox CreateCheckbox()</w:t>
-      </w:r>
-      <w:r>
-        <w:rPr>
-          <w:rFonts w:ascii="Courier New" w:hAnsi="Courier New" w:cs="Courier New"/>
-          <w:noProof/>
-          <w:color w:val="000000" w:themeColor="text1"/>
-          <w:lang w:val="uk-UA"/>
-        </w:rPr>
-        <w:br/>
-        <w:t xml:space="preserve">    {</w:t>
-      </w:r>
-      <w:r>
-        <w:rPr>
-          <w:rFonts w:ascii="Courier New" w:hAnsi="Courier New" w:cs="Courier New"/>
-          <w:noProof/>
-          <w:color w:val="000000" w:themeColor="text1"/>
-          <w:lang w:val="uk-UA"/>
-        </w:rPr>
-        <w:br/>
-        <w:t xml:space="preserve">        return new WindowsCheckbox();</w:t>
-      </w:r>
-      <w:r>
-        <w:rPr>
-          <w:rFonts w:ascii="Courier New" w:hAnsi="Courier New" w:cs="Courier New"/>
-          <w:noProof/>
-          <w:color w:val="000000" w:themeColor="text1"/>
-          <w:lang w:val="uk-UA"/>
-        </w:rPr>
-        <w:br/>
-        <w:t xml:space="preserve">    }</w:t>
-      </w:r>
-      <w:r>
-        <w:rPr>
-          <w:rFonts w:ascii="Courier New" w:hAnsi="Courier New" w:cs="Courier New"/>
-          <w:noProof/>
-          <w:color w:val="000000" w:themeColor="text1"/>
-          <w:lang w:val="uk-UA"/>
-        </w:rPr>
-        <w:br/>
-        <w:t>}</w:t>
-      </w:r>
-    </w:p>
-    <w:p>
-      <w:pPr>
-        <w:spacing w:line="360" w:lineRule="auto"/>
-        <w:rPr>
-          <w:noProof/>
-          <w:sz w:val="28"/>
-          <w:szCs w:val="28"/>
-          <w:lang w:val="uk-UA"/>
-        </w:rPr>
-      </w:pPr>
-    </w:p>
-    <w:p>
-      <w:pPr>
-        <w:spacing w:line="360" w:lineRule="auto"/>
-        <w:jc w:val="center"/>
-        <w:rPr>
-          <w:noProof/>
-          <w:sz w:val="28"/>
-          <w:szCs w:val="28"/>
-          <w:lang w:val="uk-UA"/>
-        </w:rPr>
-      </w:pPr>
-      <w:r>
-        <w:rPr>
-          <w:noProof/>
-          <w:sz w:val="28"/>
-          <w:szCs w:val="28"/>
-          <w:lang w:val="uk-UA"/>
-        </w:rPr>
-        <w:t>WindowsButton.cs</w:t>
-      </w:r>
-    </w:p>
-    <w:p>
-      <w:pPr>
-        <w:widowControl/>
-        <w:tabs>
-          <w:tab w:val="left" w:pos="916"/>
-          <w:tab w:val="left" w:pos="1832"/>
-          <w:tab w:val="left" w:pos="2748"/>
-          <w:tab w:val="left" w:pos="3664"/>
-          <w:tab w:val="left" w:pos="4580"/>
-          <w:tab w:val="left" w:pos="5496"/>
-          <w:tab w:val="left" w:pos="6412"/>
-          <w:tab w:val="left" w:pos="7328"/>
-          <w:tab w:val="left" w:pos="8244"/>
-          <w:tab w:val="left" w:pos="9160"/>
-          <w:tab w:val="left" w:pos="10076"/>
-          <w:tab w:val="left" w:pos="10992"/>
-          <w:tab w:val="left" w:pos="11908"/>
-          <w:tab w:val="left" w:pos="12824"/>
-          <w:tab w:val="left" w:pos="13740"/>
-          <w:tab w:val="left" w:pos="14656"/>
-        </w:tabs>
-        <w:spacing w:line="240" w:lineRule="auto"/>
-        <w:rPr>
-          <w:rFonts w:ascii="Courier New" w:hAnsi="Courier New" w:cs="Courier New"/>
-          <w:noProof/>
-          <w:color w:val="000000" w:themeColor="text1"/>
-          <w:lang w:val="uk-UA"/>
-        </w:rPr>
-      </w:pPr>
-      <w:r>
-        <w:rPr>
-          <w:rFonts w:ascii="Courier New" w:hAnsi="Courier New" w:cs="Courier New"/>
-          <w:noProof/>
-          <w:color w:val="000000" w:themeColor="text1"/>
-          <w:lang w:val="uk-UA"/>
-        </w:rPr>
-        <w:t>namespace abstract_factory;</w:t>
-      </w:r>
-      <w:r>
-        <w:rPr>
-          <w:rFonts w:ascii="Courier New" w:hAnsi="Courier New" w:cs="Courier New"/>
-          <w:noProof/>
-          <w:color w:val="000000" w:themeColor="text1"/>
-          <w:lang w:val="uk-UA"/>
-        </w:rPr>
-        <w:br/>
-      </w:r>
-      <w:r>
-        <w:rPr>
-          <w:rFonts w:ascii="Courier New" w:hAnsi="Courier New" w:cs="Courier New"/>
-          <w:noProof/>
-          <w:color w:val="000000" w:themeColor="text1"/>
-          <w:lang w:val="uk-UA"/>
-        </w:rPr>
-        <w:br/>
-        <w:t>public class WindowsButton : IButton</w:t>
-      </w:r>
-      <w:r>
-        <w:rPr>
-          <w:rFonts w:ascii="Courier New" w:hAnsi="Courier New" w:cs="Courier New"/>
-          <w:noProof/>
-          <w:color w:val="000000" w:themeColor="text1"/>
-          <w:lang w:val="uk-UA"/>
-        </w:rPr>
-        <w:br/>
-        <w:t>{</w:t>
-      </w:r>
-      <w:r>
-        <w:rPr>
-          <w:rFonts w:ascii="Courier New" w:hAnsi="Courier New" w:cs="Courier New"/>
-          <w:noProof/>
-          <w:color w:val="000000" w:themeColor="text1"/>
-          <w:lang w:val="uk-UA"/>
-        </w:rPr>
-        <w:br/>
-        <w:t xml:space="preserve">    public void Render()</w:t>
-      </w:r>
-      <w:r>
-        <w:rPr>
-          <w:rFonts w:ascii="Courier New" w:hAnsi="Courier New" w:cs="Courier New"/>
-          <w:noProof/>
-          <w:color w:val="000000" w:themeColor="text1"/>
-          <w:lang w:val="uk-UA"/>
-        </w:rPr>
-        <w:br/>
-        <w:t xml:space="preserve">    {</w:t>
-      </w:r>
-      <w:r>
-        <w:rPr>
-          <w:rFonts w:ascii="Courier New" w:hAnsi="Courier New" w:cs="Courier New"/>
-          <w:noProof/>
-          <w:color w:val="000000" w:themeColor="text1"/>
-          <w:lang w:val="uk-UA"/>
-        </w:rPr>
-        <w:br/>
-        <w:t xml:space="preserve">        Console.WriteLine("Малюємо Windows кнопку у стилі Fluent Design.");</w:t>
-      </w:r>
-      <w:r>
-        <w:rPr>
-          <w:rFonts w:ascii="Courier New" w:hAnsi="Courier New" w:cs="Courier New"/>
-          <w:noProof/>
-          <w:color w:val="000000" w:themeColor="text1"/>
-          <w:lang w:val="uk-UA"/>
-        </w:rPr>
-        <w:br/>
-      </w:r>
-      <w:r>
-        <w:rPr>
-          <w:rFonts w:ascii="Courier New" w:hAnsi="Courier New" w:cs="Courier New"/>
-          <w:noProof/>
-          <w:color w:val="000000" w:themeColor="text1"/>
-          <w:lang w:val="uk-UA"/>
-        </w:rPr>
-        <w:lastRenderedPageBreak/>
-        <w:t xml:space="preserve">    }</w:t>
-      </w:r>
-      <w:r>
-        <w:rPr>
-          <w:rFonts w:ascii="Courier New" w:hAnsi="Courier New" w:cs="Courier New"/>
-          <w:noProof/>
-          <w:color w:val="000000" w:themeColor="text1"/>
-          <w:lang w:val="uk-UA"/>
-        </w:rPr>
-        <w:br/>
-      </w:r>
-      <w:r>
-        <w:rPr>
-          <w:rFonts w:ascii="Courier New" w:hAnsi="Courier New" w:cs="Courier New"/>
-          <w:noProof/>
-          <w:color w:val="000000" w:themeColor="text1"/>
-          <w:lang w:val="uk-UA"/>
-        </w:rPr>
-        <w:br/>
-        <w:t xml:space="preserve">    public void OnClick()</w:t>
-      </w:r>
-      <w:r>
-        <w:rPr>
-          <w:rFonts w:ascii="Courier New" w:hAnsi="Courier New" w:cs="Courier New"/>
-          <w:noProof/>
-          <w:color w:val="000000" w:themeColor="text1"/>
-          <w:lang w:val="uk-UA"/>
-        </w:rPr>
-        <w:br/>
-        <w:t xml:space="preserve">    {</w:t>
-      </w:r>
-      <w:r>
-        <w:rPr>
-          <w:rFonts w:ascii="Courier New" w:hAnsi="Courier New" w:cs="Courier New"/>
-          <w:noProof/>
-          <w:color w:val="000000" w:themeColor="text1"/>
-          <w:lang w:val="uk-UA"/>
-        </w:rPr>
-        <w:br/>
-        <w:t xml:space="preserve">        Console.WriteLine("Обробка натискання Windows кнопки.");</w:t>
-      </w:r>
-      <w:r>
-        <w:rPr>
-          <w:rFonts w:ascii="Courier New" w:hAnsi="Courier New" w:cs="Courier New"/>
-          <w:noProof/>
-          <w:color w:val="000000" w:themeColor="text1"/>
-          <w:lang w:val="uk-UA"/>
-        </w:rPr>
-        <w:br/>
-        <w:t xml:space="preserve">    }</w:t>
-      </w:r>
-      <w:r>
-        <w:rPr>
-          <w:rFonts w:ascii="Courier New" w:hAnsi="Courier New" w:cs="Courier New"/>
-          <w:noProof/>
-          <w:color w:val="000000" w:themeColor="text1"/>
-          <w:lang w:val="uk-UA"/>
-        </w:rPr>
-        <w:br/>
-        <w:t>}</w:t>
-      </w:r>
-    </w:p>
-    <w:p>
-      <w:pPr>
-        <w:spacing w:line="360" w:lineRule="auto"/>
-        <w:rPr>
-          <w:noProof/>
-          <w:sz w:val="28"/>
-          <w:szCs w:val="28"/>
-          <w:lang w:val="uk-UA"/>
-        </w:rPr>
-      </w:pPr>
-    </w:p>
-    <w:p>
-      <w:pPr>
-        <w:spacing w:line="360" w:lineRule="auto"/>
-        <w:jc w:val="center"/>
-        <w:rPr>
-          <w:noProof/>
-          <w:sz w:val="28"/>
-          <w:szCs w:val="28"/>
-          <w:lang w:val="uk-UA"/>
-        </w:rPr>
-      </w:pPr>
-      <w:r>
-        <w:rPr>
-          <w:noProof/>
-          <w:sz w:val="28"/>
-          <w:szCs w:val="28"/>
-          <w:lang w:val="uk-UA"/>
-        </w:rPr>
-        <w:t>WindowsCheckbox.cs</w:t>
-      </w:r>
-    </w:p>
-    <w:p>
-      <w:pPr>
-        <w:widowControl/>
-        <w:tabs>
-          <w:tab w:val="left" w:pos="916"/>
-          <w:tab w:val="left" w:pos="1832"/>
-          <w:tab w:val="left" w:pos="2748"/>
-          <w:tab w:val="left" w:pos="3664"/>
-          <w:tab w:val="left" w:pos="4580"/>
-          <w:tab w:val="left" w:pos="5496"/>
-          <w:tab w:val="left" w:pos="6412"/>
-          <w:tab w:val="left" w:pos="7328"/>
-          <w:tab w:val="left" w:pos="8244"/>
-          <w:tab w:val="left" w:pos="9160"/>
-          <w:tab w:val="left" w:pos="10076"/>
-          <w:tab w:val="left" w:pos="10992"/>
-          <w:tab w:val="left" w:pos="11908"/>
-          <w:tab w:val="left" w:pos="12824"/>
-          <w:tab w:val="left" w:pos="13740"/>
-          <w:tab w:val="left" w:pos="14656"/>
-        </w:tabs>
-        <w:spacing w:line="240" w:lineRule="auto"/>
-        <w:rPr>
-          <w:rFonts w:ascii="Courier New" w:hAnsi="Courier New" w:cs="Courier New"/>
-          <w:noProof/>
-          <w:color w:val="000000" w:themeColor="text1"/>
-          <w:lang w:val="uk-UA"/>
-        </w:rPr>
-      </w:pPr>
-      <w:r>
-        <w:rPr>
-          <w:rFonts w:ascii="Courier New" w:hAnsi="Courier New" w:cs="Courier New"/>
-          <w:noProof/>
-          <w:color w:val="000000" w:themeColor="text1"/>
-          <w:lang w:val="uk-UA"/>
-        </w:rPr>
-        <w:t>namespace abstract_factory;</w:t>
-      </w:r>
-      <w:r>
-        <w:rPr>
-          <w:rFonts w:ascii="Courier New" w:hAnsi="Courier New" w:cs="Courier New"/>
-          <w:noProof/>
-          <w:color w:val="000000" w:themeColor="text1"/>
-          <w:lang w:val="uk-UA"/>
-        </w:rPr>
-        <w:br/>
-      </w:r>
-      <w:r>
-        <w:rPr>
-          <w:rFonts w:ascii="Courier New" w:hAnsi="Courier New" w:cs="Courier New"/>
-          <w:noProof/>
-          <w:color w:val="000000" w:themeColor="text1"/>
-          <w:lang w:val="uk-UA"/>
-        </w:rPr>
-        <w:br/>
-        <w:t>public class WindowsCheckbox : ICheckbox</w:t>
-      </w:r>
-      <w:r>
-        <w:rPr>
-          <w:rFonts w:ascii="Courier New" w:hAnsi="Courier New" w:cs="Courier New"/>
-          <w:noProof/>
-          <w:color w:val="000000" w:themeColor="text1"/>
-          <w:lang w:val="uk-UA"/>
-        </w:rPr>
-        <w:br/>
-        <w:t>{</w:t>
-      </w:r>
-      <w:r>
-        <w:rPr>
-          <w:rFonts w:ascii="Courier New" w:hAnsi="Courier New" w:cs="Courier New"/>
-          <w:noProof/>
-          <w:color w:val="000000" w:themeColor="text1"/>
-          <w:lang w:val="uk-UA"/>
-        </w:rPr>
-        <w:br/>
-        <w:t xml:space="preserve">    public void Render()</w:t>
-      </w:r>
-      <w:r>
-        <w:rPr>
-          <w:rFonts w:ascii="Courier New" w:hAnsi="Courier New" w:cs="Courier New"/>
-          <w:noProof/>
-          <w:color w:val="000000" w:themeColor="text1"/>
-          <w:lang w:val="uk-UA"/>
-        </w:rPr>
-        <w:br/>
-        <w:t xml:space="preserve">    {</w:t>
-      </w:r>
-      <w:r>
-        <w:rPr>
-          <w:rFonts w:ascii="Courier New" w:hAnsi="Courier New" w:cs="Courier New"/>
-          <w:noProof/>
-          <w:color w:val="000000" w:themeColor="text1"/>
-          <w:lang w:val="uk-UA"/>
-        </w:rPr>
-        <w:br/>
-        <w:t xml:space="preserve">        Console.WriteLine("Малюємо Windows чекбокс.");</w:t>
-      </w:r>
-      <w:r>
-        <w:rPr>
-          <w:rFonts w:ascii="Courier New" w:hAnsi="Courier New" w:cs="Courier New"/>
-          <w:noProof/>
-          <w:color w:val="000000" w:themeColor="text1"/>
-          <w:lang w:val="uk-UA"/>
-        </w:rPr>
-        <w:br/>
-        <w:t xml:space="preserve">    }</w:t>
-      </w:r>
-      <w:r>
-        <w:rPr>
-          <w:rFonts w:ascii="Courier New" w:hAnsi="Courier New" w:cs="Courier New"/>
-          <w:noProof/>
-          <w:color w:val="000000" w:themeColor="text1"/>
-          <w:lang w:val="uk-UA"/>
-        </w:rPr>
-        <w:br/>
-      </w:r>
-      <w:r>
-        <w:rPr>
-          <w:rFonts w:ascii="Courier New" w:hAnsi="Courier New" w:cs="Courier New"/>
-          <w:noProof/>
-          <w:color w:val="000000" w:themeColor="text1"/>
-          <w:lang w:val="uk-UA"/>
-        </w:rPr>
-        <w:br/>
-        <w:t xml:space="preserve">    public void OnClick()</w:t>
-      </w:r>
-      <w:r>
-        <w:rPr>
-          <w:rFonts w:ascii="Courier New" w:hAnsi="Courier New" w:cs="Courier New"/>
-          <w:noProof/>
-          <w:color w:val="000000" w:themeColor="text1"/>
-          <w:lang w:val="uk-UA"/>
-        </w:rPr>
-        <w:br/>
-        <w:t xml:space="preserve">    {</w:t>
-      </w:r>
-      <w:r>
-        <w:rPr>
-          <w:rFonts w:ascii="Courier New" w:hAnsi="Courier New" w:cs="Courier New"/>
-          <w:noProof/>
-          <w:color w:val="000000" w:themeColor="text1"/>
-          <w:lang w:val="uk-UA"/>
-        </w:rPr>
-        <w:br/>
-        <w:t xml:space="preserve">        Console.WriteLine("Зміна стану Windows чекбокса.");</w:t>
-      </w:r>
-      <w:r>
-        <w:rPr>
-          <w:rFonts w:ascii="Courier New" w:hAnsi="Courier New" w:cs="Courier New"/>
-          <w:noProof/>
-          <w:color w:val="000000" w:themeColor="text1"/>
-          <w:lang w:val="uk-UA"/>
-        </w:rPr>
-        <w:br/>
-        <w:t xml:space="preserve">    }</w:t>
-      </w:r>
-      <w:r>
-        <w:rPr>
-          <w:rFonts w:ascii="Courier New" w:hAnsi="Courier New" w:cs="Courier New"/>
-          <w:noProof/>
-          <w:color w:val="000000" w:themeColor="text1"/>
-          <w:lang w:val="uk-UA"/>
-        </w:rPr>
-        <w:br/>
-        <w:t>}</w:t>
-      </w:r>
-    </w:p>
-    <w:p>
-      <w:pPr>
-        <w:spacing w:line="360" w:lineRule="auto"/>
-        <w:rPr>
-          <w:noProof/>
-          <w:sz w:val="28"/>
-          <w:szCs w:val="28"/>
-          <w:lang w:val="uk-UA"/>
-        </w:rPr>
-      </w:pPr>
-    </w:p>
-    <w:p>
-      <w:pPr>
-        <w:spacing w:line="360" w:lineRule="auto"/>
-        <w:jc w:val="center"/>
-        <w:rPr>
-          <w:noProof/>
-          <w:sz w:val="28"/>
-          <w:szCs w:val="28"/>
-          <w:lang w:val="uk-UA"/>
-        </w:rPr>
-      </w:pPr>
-      <w:r>
-        <w:rPr>
-          <w:noProof/>
-          <w:sz w:val="28"/>
-          <w:szCs w:val="28"/>
-          <w:lang w:val="uk-UA"/>
-        </w:rPr>
-        <w:t>MacFactory.cs</w:t>
-      </w:r>
-    </w:p>
-    <w:p>
-      <w:pPr>
-        <w:widowControl/>
-        <w:tabs>
-          <w:tab w:val="left" w:pos="916"/>
-          <w:tab w:val="left" w:pos="1832"/>
-          <w:tab w:val="left" w:pos="2748"/>
-          <w:tab w:val="left" w:pos="3664"/>
-          <w:tab w:val="left" w:pos="4580"/>
-          <w:tab w:val="left" w:pos="5496"/>
-          <w:tab w:val="left" w:pos="6412"/>
-          <w:tab w:val="left" w:pos="7328"/>
-          <w:tab w:val="left" w:pos="8244"/>
-          <w:tab w:val="left" w:pos="9160"/>
-          <w:tab w:val="left" w:pos="10076"/>
-          <w:tab w:val="left" w:pos="10992"/>
-          <w:tab w:val="left" w:pos="11908"/>
-          <w:tab w:val="left" w:pos="12824"/>
-          <w:tab w:val="left" w:pos="13740"/>
-          <w:tab w:val="left" w:pos="14656"/>
-        </w:tabs>
-        <w:spacing w:line="240" w:lineRule="auto"/>
-        <w:rPr>
-          <w:rFonts w:ascii="Courier New" w:hAnsi="Courier New" w:cs="Courier New"/>
-          <w:noProof/>
-          <w:color w:val="000000" w:themeColor="text1"/>
-          <w:lang w:val="uk-UA"/>
-        </w:rPr>
-      </w:pPr>
-      <w:r>
-        <w:rPr>
-          <w:rFonts w:ascii="Courier New" w:hAnsi="Courier New" w:cs="Courier New"/>
-          <w:noProof/>
-          <w:color w:val="000000" w:themeColor="text1"/>
-          <w:lang w:val="uk-UA"/>
-        </w:rPr>
-        <w:t>namespace abstract_factory;</w:t>
-      </w:r>
-      <w:r>
-        <w:rPr>
-          <w:rFonts w:ascii="Courier New" w:hAnsi="Courier New" w:cs="Courier New"/>
-          <w:noProof/>
-          <w:color w:val="000000" w:themeColor="text1"/>
-          <w:lang w:val="uk-UA"/>
-        </w:rPr>
-        <w:br/>
-      </w:r>
-      <w:r>
-        <w:rPr>
-          <w:rFonts w:ascii="Courier New" w:hAnsi="Courier New" w:cs="Courier New"/>
-          <w:noProof/>
-          <w:color w:val="000000" w:themeColor="text1"/>
-          <w:lang w:val="uk-UA"/>
-        </w:rPr>
-        <w:br/>
-        <w:t>public class MacFactory: IUIFactory</w:t>
-      </w:r>
-      <w:r>
-        <w:rPr>
-          <w:rFonts w:ascii="Courier New" w:hAnsi="Courier New" w:cs="Courier New"/>
-          <w:noProof/>
-          <w:color w:val="000000" w:themeColor="text1"/>
-          <w:lang w:val="uk-UA"/>
-        </w:rPr>
-        <w:br/>
-        <w:t>{</w:t>
-      </w:r>
-      <w:r>
-        <w:rPr>
-          <w:rFonts w:ascii="Courier New" w:hAnsi="Courier New" w:cs="Courier New"/>
-          <w:noProof/>
-          <w:color w:val="000000" w:themeColor="text1"/>
-          <w:lang w:val="uk-UA"/>
-        </w:rPr>
-        <w:br/>
-        <w:t xml:space="preserve">    public IButton CreateButton()</w:t>
-      </w:r>
-      <w:r>
-        <w:rPr>
-          <w:rFonts w:ascii="Courier New" w:hAnsi="Courier New" w:cs="Courier New"/>
-          <w:noProof/>
-          <w:color w:val="000000" w:themeColor="text1"/>
-          <w:lang w:val="uk-UA"/>
-        </w:rPr>
-        <w:br/>
-        <w:t xml:space="preserve">    {</w:t>
-      </w:r>
-      <w:r>
-        <w:rPr>
-          <w:rFonts w:ascii="Courier New" w:hAnsi="Courier New" w:cs="Courier New"/>
-          <w:noProof/>
-          <w:color w:val="000000" w:themeColor="text1"/>
-          <w:lang w:val="uk-UA"/>
-        </w:rPr>
-        <w:br/>
-        <w:t xml:space="preserve">        return new MacButton();</w:t>
-      </w:r>
-      <w:r>
-        <w:rPr>
-          <w:rFonts w:ascii="Courier New" w:hAnsi="Courier New" w:cs="Courier New"/>
-          <w:noProof/>
-          <w:color w:val="000000" w:themeColor="text1"/>
-          <w:lang w:val="uk-UA"/>
-        </w:rPr>
-        <w:br/>
-        <w:t xml:space="preserve">    }</w:t>
-      </w:r>
-      <w:r>
-        <w:rPr>
-          <w:rFonts w:ascii="Courier New" w:hAnsi="Courier New" w:cs="Courier New"/>
-          <w:noProof/>
-          <w:color w:val="000000" w:themeColor="text1"/>
-          <w:lang w:val="uk-UA"/>
-        </w:rPr>
-        <w:br/>
-      </w:r>
-      <w:r>
-        <w:rPr>
-          <w:rFonts w:ascii="Courier New" w:hAnsi="Courier New" w:cs="Courier New"/>
-          <w:noProof/>
-          <w:color w:val="000000" w:themeColor="text1"/>
-          <w:lang w:val="uk-UA"/>
-        </w:rPr>
-        <w:br/>
-        <w:t xml:space="preserve">    public ICheckbox CreateCheckbox()</w:t>
-      </w:r>
-      <w:r>
-        <w:rPr>
-          <w:rFonts w:ascii="Courier New" w:hAnsi="Courier New" w:cs="Courier New"/>
-          <w:noProof/>
-          <w:color w:val="000000" w:themeColor="text1"/>
-          <w:lang w:val="uk-UA"/>
-        </w:rPr>
-        <w:br/>
-        <w:t xml:space="preserve">    {</w:t>
-      </w:r>
-      <w:r>
-        <w:rPr>
-          <w:rFonts w:ascii="Courier New" w:hAnsi="Courier New" w:cs="Courier New"/>
-          <w:noProof/>
-          <w:color w:val="000000" w:themeColor="text1"/>
-          <w:lang w:val="uk-UA"/>
-        </w:rPr>
-        <w:br/>
-        <w:t xml:space="preserve">        return new MacCheckbox();</w:t>
-      </w:r>
-      <w:r>
-        <w:rPr>
-          <w:rFonts w:ascii="Courier New" w:hAnsi="Courier New" w:cs="Courier New"/>
-          <w:noProof/>
-          <w:color w:val="000000" w:themeColor="text1"/>
-          <w:lang w:val="uk-UA"/>
-        </w:rPr>
-        <w:br/>
-        <w:t xml:space="preserve">    }</w:t>
-      </w:r>
-      <w:r>
-        <w:rPr>
-          <w:rFonts w:ascii="Courier New" w:hAnsi="Courier New" w:cs="Courier New"/>
-          <w:noProof/>
-          <w:color w:val="000000" w:themeColor="text1"/>
-          <w:lang w:val="uk-UA"/>
-        </w:rPr>
-        <w:br/>
-        <w:t>}</w:t>
-      </w:r>
-    </w:p>
-    <w:p>
-      <w:pPr>
-        <w:spacing w:line="360" w:lineRule="auto"/>
-        <w:rPr>
-          <w:noProof/>
-          <w:sz w:val="28"/>
-          <w:szCs w:val="28"/>
-          <w:lang w:val="uk-UA"/>
-        </w:rPr>
-      </w:pPr>
-    </w:p>
-    <w:p>
-      <w:pPr>
-        <w:spacing w:line="360" w:lineRule="auto"/>
-        <w:jc w:val="center"/>
-        <w:rPr>
-          <w:noProof/>
-          <w:sz w:val="28"/>
-          <w:szCs w:val="28"/>
-          <w:lang w:val="uk-UA"/>
-        </w:rPr>
-      </w:pPr>
-      <w:r>
-        <w:rPr>
-          <w:noProof/>
-          <w:sz w:val="28"/>
-          <w:szCs w:val="28"/>
-          <w:lang w:val="uk-UA"/>
-        </w:rPr>
-        <w:t>MacButton.cs</w:t>
-      </w:r>
-    </w:p>
-    <w:p>
-      <w:pPr>
-        <w:widowControl/>
-        <w:tabs>
-          <w:tab w:val="left" w:pos="916"/>
-          <w:tab w:val="left" w:pos="1832"/>
-          <w:tab w:val="left" w:pos="2748"/>
-          <w:tab w:val="left" w:pos="3664"/>
-          <w:tab w:val="left" w:pos="4580"/>
-          <w:tab w:val="left" w:pos="5496"/>
-          <w:tab w:val="left" w:pos="6412"/>
-          <w:tab w:val="left" w:pos="7328"/>
-          <w:tab w:val="left" w:pos="8244"/>
-          <w:tab w:val="left" w:pos="9160"/>
-          <w:tab w:val="left" w:pos="10076"/>
-          <w:tab w:val="left" w:pos="10992"/>
-          <w:tab w:val="left" w:pos="11908"/>
-          <w:tab w:val="left" w:pos="12824"/>
-          <w:tab w:val="left" w:pos="13740"/>
-          <w:tab w:val="left" w:pos="14656"/>
-        </w:tabs>
-        <w:spacing w:line="240" w:lineRule="auto"/>
-        <w:rPr>
-          <w:rFonts w:ascii="Courier New" w:hAnsi="Courier New" w:cs="Courier New"/>
-          <w:noProof/>
-          <w:color w:val="000000" w:themeColor="text1"/>
-          <w:lang w:val="uk-UA"/>
-        </w:rPr>
-      </w:pPr>
-      <w:r>
-        <w:rPr>
-          <w:rFonts w:ascii="Courier New" w:hAnsi="Courier New" w:cs="Courier New"/>
-          <w:noProof/>
-          <w:color w:val="000000" w:themeColor="text1"/>
-          <w:lang w:val="uk-UA"/>
-        </w:rPr>
-        <w:t>namespace abstract_factory;</w:t>
-      </w:r>
-      <w:r>
-        <w:rPr>
-          <w:rFonts w:ascii="Courier New" w:hAnsi="Courier New" w:cs="Courier New"/>
-          <w:noProof/>
-          <w:color w:val="000000" w:themeColor="text1"/>
-          <w:lang w:val="uk-UA"/>
-        </w:rPr>
-        <w:br/>
-      </w:r>
-      <w:r>
-        <w:rPr>
-          <w:rFonts w:ascii="Courier New" w:hAnsi="Courier New" w:cs="Courier New"/>
-          <w:noProof/>
-          <w:color w:val="000000" w:themeColor="text1"/>
-          <w:lang w:val="uk-UA"/>
-        </w:rPr>
-        <w:br/>
-        <w:t>public class MacButton : IButton</w:t>
-      </w:r>
-      <w:r>
-        <w:rPr>
-          <w:rFonts w:ascii="Courier New" w:hAnsi="Courier New" w:cs="Courier New"/>
-          <w:noProof/>
-          <w:color w:val="000000" w:themeColor="text1"/>
-          <w:lang w:val="uk-UA"/>
-        </w:rPr>
-        <w:br/>
-        <w:t>{</w:t>
-      </w:r>
-      <w:r>
-        <w:rPr>
-          <w:rFonts w:ascii="Courier New" w:hAnsi="Courier New" w:cs="Courier New"/>
-          <w:noProof/>
-          <w:color w:val="000000" w:themeColor="text1"/>
-          <w:lang w:val="uk-UA"/>
-        </w:rPr>
-        <w:br/>
-        <w:t xml:space="preserve">    public void Render()</w:t>
-      </w:r>
-      <w:r>
-        <w:rPr>
-          <w:rFonts w:ascii="Courier New" w:hAnsi="Courier New" w:cs="Courier New"/>
-          <w:noProof/>
-          <w:color w:val="000000" w:themeColor="text1"/>
-          <w:lang w:val="uk-UA"/>
-        </w:rPr>
-        <w:br/>
-        <w:t xml:space="preserve">    {</w:t>
-      </w:r>
-      <w:r>
-        <w:rPr>
-          <w:rFonts w:ascii="Courier New" w:hAnsi="Courier New" w:cs="Courier New"/>
-          <w:noProof/>
-          <w:color w:val="000000" w:themeColor="text1"/>
-          <w:lang w:val="uk-UA"/>
-        </w:rPr>
-        <w:br/>
-        <w:t xml:space="preserve">        Console.WriteLine("Малюємо Mac кнопку у стилі Aqua.");</w:t>
-      </w:r>
-      <w:r>
-        <w:rPr>
-          <w:rFonts w:ascii="Courier New" w:hAnsi="Courier New" w:cs="Courier New"/>
-          <w:noProof/>
-          <w:color w:val="000000" w:themeColor="text1"/>
-          <w:lang w:val="uk-UA"/>
-        </w:rPr>
-        <w:br/>
-        <w:t xml:space="preserve">    }</w:t>
-      </w:r>
-      <w:r>
-        <w:rPr>
-          <w:rFonts w:ascii="Courier New" w:hAnsi="Courier New" w:cs="Courier New"/>
-          <w:noProof/>
-          <w:color w:val="000000" w:themeColor="text1"/>
-          <w:lang w:val="uk-UA"/>
-        </w:rPr>
-        <w:br/>
-      </w:r>
-      <w:r>
-        <w:rPr>
-          <w:rFonts w:ascii="Courier New" w:hAnsi="Courier New" w:cs="Courier New"/>
-          <w:noProof/>
-          <w:color w:val="000000" w:themeColor="text1"/>
-          <w:lang w:val="uk-UA"/>
-        </w:rPr>
-        <w:br/>
-        <w:t xml:space="preserve">    public void OnClick()</w:t>
-      </w:r>
-      <w:r>
-        <w:rPr>
-          <w:rFonts w:ascii="Courier New" w:hAnsi="Courier New" w:cs="Courier New"/>
-          <w:noProof/>
-          <w:color w:val="000000" w:themeColor="text1"/>
-          <w:lang w:val="uk-UA"/>
-        </w:rPr>
-        <w:br/>
-        <w:t xml:space="preserve">    {</w:t>
-      </w:r>
-      <w:r>
-        <w:rPr>
-          <w:rFonts w:ascii="Courier New" w:hAnsi="Courier New" w:cs="Courier New"/>
-          <w:noProof/>
-          <w:color w:val="000000" w:themeColor="text1"/>
-          <w:lang w:val="uk-UA"/>
-        </w:rPr>
-        <w:br/>
-        <w:t xml:space="preserve">        Console.WriteLine("Обробка натискання Mac кнопки.");</w:t>
-      </w:r>
-      <w:r>
-        <w:rPr>
-          <w:rFonts w:ascii="Courier New" w:hAnsi="Courier New" w:cs="Courier New"/>
-          <w:noProof/>
-          <w:color w:val="000000" w:themeColor="text1"/>
-          <w:lang w:val="uk-UA"/>
-        </w:rPr>
-        <w:br/>
-        <w:t xml:space="preserve">    }</w:t>
-      </w:r>
-      <w:r>
-        <w:rPr>
-          <w:rFonts w:ascii="Courier New" w:hAnsi="Courier New" w:cs="Courier New"/>
-          <w:noProof/>
-          <w:color w:val="000000" w:themeColor="text1"/>
-          <w:lang w:val="uk-UA"/>
-        </w:rPr>
-        <w:br/>
-        <w:t>}</w:t>
-      </w:r>
-    </w:p>
-    <w:p>
-      <w:pPr>
-        <w:spacing w:line="360" w:lineRule="auto"/>
-        <w:rPr>
-          <w:noProof/>
-          <w:sz w:val="28"/>
-          <w:szCs w:val="28"/>
-          <w:lang w:val="uk-UA"/>
-        </w:rPr>
-      </w:pPr>
-    </w:p>
-    <w:p>
-      <w:pPr>
-        <w:spacing w:line="360" w:lineRule="auto"/>
-        <w:jc w:val="center"/>
-        <w:rPr>
-          <w:noProof/>
-          <w:sz w:val="28"/>
-          <w:szCs w:val="28"/>
-          <w:lang w:val="uk-UA"/>
-        </w:rPr>
-      </w:pPr>
-      <w:r>
-        <w:rPr>
-          <w:noProof/>
-          <w:sz w:val="28"/>
-          <w:szCs w:val="28"/>
-          <w:lang w:val="uk-UA"/>
-        </w:rPr>
-        <w:lastRenderedPageBreak/>
-        <w:t>MacCheckbox.cs</w:t>
-      </w:r>
-    </w:p>
-    <w:p>
-      <w:pPr>
-        <w:widowControl/>
-        <w:tabs>
-          <w:tab w:val="left" w:pos="916"/>
-          <w:tab w:val="left" w:pos="1832"/>
-          <w:tab w:val="left" w:pos="2748"/>
-          <w:tab w:val="left" w:pos="3664"/>
-          <w:tab w:val="left" w:pos="4580"/>
-          <w:tab w:val="left" w:pos="5496"/>
-          <w:tab w:val="left" w:pos="6412"/>
-          <w:tab w:val="left" w:pos="7328"/>
-          <w:tab w:val="left" w:pos="8244"/>
-          <w:tab w:val="left" w:pos="9160"/>
-          <w:tab w:val="left" w:pos="10076"/>
-          <w:tab w:val="left" w:pos="10992"/>
-          <w:tab w:val="left" w:pos="11908"/>
-          <w:tab w:val="left" w:pos="12824"/>
-          <w:tab w:val="left" w:pos="13740"/>
-          <w:tab w:val="left" w:pos="14656"/>
-        </w:tabs>
-        <w:spacing w:line="240" w:lineRule="auto"/>
-        <w:rPr>
-          <w:rFonts w:ascii="Courier New" w:hAnsi="Courier New" w:cs="Courier New"/>
-          <w:noProof/>
-          <w:color w:val="000000" w:themeColor="text1"/>
-          <w:lang w:val="uk-UA"/>
-        </w:rPr>
-      </w:pPr>
-      <w:r>
-        <w:rPr>
-          <w:rFonts w:ascii="Courier New" w:hAnsi="Courier New" w:cs="Courier New"/>
-          <w:noProof/>
-          <w:color w:val="000000" w:themeColor="text1"/>
-          <w:lang w:val="uk-UA"/>
-        </w:rPr>
-        <w:t>namespace abstract_factory;</w:t>
-      </w:r>
-      <w:r>
-        <w:rPr>
-          <w:rFonts w:ascii="Courier New" w:hAnsi="Courier New" w:cs="Courier New"/>
-          <w:noProof/>
-          <w:color w:val="000000" w:themeColor="text1"/>
-          <w:lang w:val="uk-UA"/>
-        </w:rPr>
-        <w:br/>
-      </w:r>
-      <w:r>
-        <w:rPr>
-          <w:rFonts w:ascii="Courier New" w:hAnsi="Courier New" w:cs="Courier New"/>
-          <w:noProof/>
-          <w:color w:val="000000" w:themeColor="text1"/>
-          <w:lang w:val="uk-UA"/>
-        </w:rPr>
-        <w:br/>
-        <w:t>public class MacCheckbox : ICheckbox</w:t>
-      </w:r>
-      <w:r>
-        <w:rPr>
-          <w:rFonts w:ascii="Courier New" w:hAnsi="Courier New" w:cs="Courier New"/>
-          <w:noProof/>
-          <w:color w:val="000000" w:themeColor="text1"/>
-          <w:lang w:val="uk-UA"/>
-        </w:rPr>
-        <w:br/>
-        <w:t>{</w:t>
-      </w:r>
-      <w:r>
-        <w:rPr>
-          <w:rFonts w:ascii="Courier New" w:hAnsi="Courier New" w:cs="Courier New"/>
-          <w:noProof/>
-          <w:color w:val="000000" w:themeColor="text1"/>
-          <w:lang w:val="uk-UA"/>
-        </w:rPr>
-        <w:br/>
-        <w:t xml:space="preserve">    public void Render()</w:t>
-      </w:r>
-      <w:r>
-        <w:rPr>
-          <w:rFonts w:ascii="Courier New" w:hAnsi="Courier New" w:cs="Courier New"/>
-          <w:noProof/>
-          <w:color w:val="000000" w:themeColor="text1"/>
-          <w:lang w:val="uk-UA"/>
-        </w:rPr>
-        <w:br/>
-        <w:t xml:space="preserve">    {</w:t>
-      </w:r>
-      <w:r>
-        <w:rPr>
-          <w:rFonts w:ascii="Courier New" w:hAnsi="Courier New" w:cs="Courier New"/>
-          <w:noProof/>
-          <w:color w:val="000000" w:themeColor="text1"/>
-          <w:lang w:val="uk-UA"/>
-        </w:rPr>
-        <w:br/>
-        <w:t xml:space="preserve">        Console.WriteLine("Малюємо Mac чекбокс.");</w:t>
-      </w:r>
-      <w:r>
-        <w:rPr>
-          <w:rFonts w:ascii="Courier New" w:hAnsi="Courier New" w:cs="Courier New"/>
-          <w:noProof/>
-          <w:color w:val="000000" w:themeColor="text1"/>
-          <w:lang w:val="uk-UA"/>
-        </w:rPr>
-        <w:br/>
-        <w:t xml:space="preserve">    }</w:t>
-      </w:r>
-      <w:r>
-        <w:rPr>
-          <w:rFonts w:ascii="Courier New" w:hAnsi="Courier New" w:cs="Courier New"/>
-          <w:noProof/>
-          <w:color w:val="000000" w:themeColor="text1"/>
-          <w:lang w:val="uk-UA"/>
-        </w:rPr>
-        <w:br/>
-      </w:r>
-      <w:r>
-        <w:rPr>
-          <w:rFonts w:ascii="Courier New" w:hAnsi="Courier New" w:cs="Courier New"/>
-          <w:noProof/>
-          <w:color w:val="000000" w:themeColor="text1"/>
-          <w:lang w:val="uk-UA"/>
-        </w:rPr>
-        <w:br/>
-        <w:t xml:space="preserve">    public void OnClick()</w:t>
-      </w:r>
-      <w:r>
-        <w:rPr>
-          <w:rFonts w:ascii="Courier New" w:hAnsi="Courier New" w:cs="Courier New"/>
-          <w:noProof/>
-          <w:color w:val="000000" w:themeColor="text1"/>
-          <w:lang w:val="uk-UA"/>
-        </w:rPr>
-        <w:br/>
-        <w:t xml:space="preserve">    {</w:t>
-      </w:r>
-      <w:r>
-        <w:rPr>
-          <w:rFonts w:ascii="Courier New" w:hAnsi="Courier New" w:cs="Courier New"/>
-          <w:noProof/>
-          <w:color w:val="000000" w:themeColor="text1"/>
-          <w:lang w:val="uk-UA"/>
-        </w:rPr>
-        <w:br/>
-        <w:t xml:space="preserve">        Console.WriteLine("Зміна стану Mac чекбокса.");</w:t>
-      </w:r>
-      <w:r>
-        <w:rPr>
-          <w:rFonts w:ascii="Courier New" w:hAnsi="Courier New" w:cs="Courier New"/>
-          <w:noProof/>
-          <w:color w:val="000000" w:themeColor="text1"/>
-          <w:lang w:val="uk-UA"/>
-        </w:rPr>
-        <w:br/>
-        <w:t xml:space="preserve">    }</w:t>
-      </w:r>
-      <w:r>
-        <w:rPr>
-          <w:rFonts w:ascii="Courier New" w:hAnsi="Courier New" w:cs="Courier New"/>
-          <w:noProof/>
-          <w:color w:val="000000" w:themeColor="text1"/>
-          <w:lang w:val="uk-UA"/>
-        </w:rPr>
-        <w:br/>
-        <w:t>}</w:t>
-      </w:r>
-    </w:p>
-    <w:p>
-      <w:pPr>
-        <w:spacing w:line="360" w:lineRule="auto"/>
-        <w:rPr>
-          <w:noProof/>
-          <w:sz w:val="28"/>
-          <w:szCs w:val="28"/>
-          <w:lang w:val="uk-UA"/>
-        </w:rPr>
-      </w:pPr>
-    </w:p>
-    <w:p>
-      <w:pPr>
-        <w:spacing w:line="360" w:lineRule="auto"/>
-        <w:jc w:val="center"/>
-        <w:rPr>
-          <w:noProof/>
-          <w:sz w:val="28"/>
-          <w:szCs w:val="28"/>
-          <w:lang w:val="uk-UA"/>
-        </w:rPr>
-      </w:pPr>
-      <w:r>
-        <w:rPr>
-          <w:noProof/>
-          <w:sz w:val="28"/>
-          <w:szCs w:val="28"/>
-          <w:lang w:val="uk-UA"/>
-        </w:rPr>
-        <w:t>Application.cs</w:t>
-      </w:r>
-    </w:p>
-    <w:p>
-      <w:pPr>
-        <w:widowControl/>
-        <w:tabs>
-          <w:tab w:val="left" w:pos="916"/>
-          <w:tab w:val="left" w:pos="1832"/>
-          <w:tab w:val="left" w:pos="2748"/>
-          <w:tab w:val="left" w:pos="3664"/>
-          <w:tab w:val="left" w:pos="4580"/>
-          <w:tab w:val="left" w:pos="5496"/>
-          <w:tab w:val="left" w:pos="6412"/>
-          <w:tab w:val="left" w:pos="7328"/>
-          <w:tab w:val="left" w:pos="8244"/>
-          <w:tab w:val="left" w:pos="9160"/>
-          <w:tab w:val="left" w:pos="10076"/>
-          <w:tab w:val="left" w:pos="10992"/>
-          <w:tab w:val="left" w:pos="11908"/>
-          <w:tab w:val="left" w:pos="12824"/>
-          <w:tab w:val="left" w:pos="13740"/>
-          <w:tab w:val="left" w:pos="14656"/>
-        </w:tabs>
-        <w:spacing w:line="240" w:lineRule="auto"/>
-        <w:rPr>
-          <w:rFonts w:ascii="Courier New" w:hAnsi="Courier New" w:cs="Courier New"/>
-          <w:noProof/>
-          <w:color w:val="000000" w:themeColor="text1"/>
-          <w:lang w:val="uk-UA"/>
-        </w:rPr>
-      </w:pPr>
-      <w:r>
-        <w:rPr>
-          <w:rFonts w:ascii="Courier New" w:hAnsi="Courier New" w:cs="Courier New"/>
-          <w:noProof/>
-          <w:color w:val="000000" w:themeColor="text1"/>
-          <w:lang w:val="uk-UA"/>
-        </w:rPr>
-        <w:t>namespace abstract_factory;</w:t>
-      </w:r>
-      <w:r>
-        <w:rPr>
-          <w:rFonts w:ascii="Courier New" w:hAnsi="Courier New" w:cs="Courier New"/>
-          <w:noProof/>
-          <w:color w:val="000000" w:themeColor="text1"/>
-          <w:lang w:val="uk-UA"/>
-        </w:rPr>
-        <w:br/>
-      </w:r>
-      <w:r>
-        <w:rPr>
-          <w:rFonts w:ascii="Courier New" w:hAnsi="Courier New" w:cs="Courier New"/>
-          <w:noProof/>
-          <w:color w:val="000000" w:themeColor="text1"/>
-          <w:lang w:val="uk-UA"/>
-        </w:rPr>
-        <w:br/>
-        <w:t>public class Application</w:t>
-      </w:r>
-      <w:r>
-        <w:rPr>
-          <w:rFonts w:ascii="Courier New" w:hAnsi="Courier New" w:cs="Courier New"/>
-          <w:noProof/>
-          <w:color w:val="000000" w:themeColor="text1"/>
-          <w:lang w:val="uk-UA"/>
-        </w:rPr>
-        <w:br/>
-        <w:t>{</w:t>
-      </w:r>
-      <w:r>
-        <w:rPr>
-          <w:rFonts w:ascii="Courier New" w:hAnsi="Courier New" w:cs="Courier New"/>
-          <w:noProof/>
-          <w:color w:val="000000" w:themeColor="text1"/>
-          <w:lang w:val="uk-UA"/>
-        </w:rPr>
-        <w:br/>
-        <w:t xml:space="preserve">    private readonly IButton _button;</w:t>
-      </w:r>
-      <w:r>
-        <w:rPr>
-          <w:rFonts w:ascii="Courier New" w:hAnsi="Courier New" w:cs="Courier New"/>
-          <w:noProof/>
-          <w:color w:val="000000" w:themeColor="text1"/>
-          <w:lang w:val="uk-UA"/>
-        </w:rPr>
-        <w:br/>
-        <w:t xml:space="preserve">    private readonly ICheckbox _checkbox;</w:t>
-      </w:r>
-      <w:r>
-        <w:rPr>
-          <w:rFonts w:ascii="Courier New" w:hAnsi="Courier New" w:cs="Courier New"/>
-          <w:noProof/>
-          <w:color w:val="000000" w:themeColor="text1"/>
-          <w:lang w:val="uk-UA"/>
-        </w:rPr>
-        <w:br/>
-        <w:t xml:space="preserve">    </w:t>
-      </w:r>
-      <w:r>
-        <w:rPr>
-          <w:rFonts w:ascii="Courier New" w:hAnsi="Courier New" w:cs="Courier New"/>
-          <w:noProof/>
-          <w:color w:val="000000" w:themeColor="text1"/>
-          <w:lang w:val="uk-UA"/>
-        </w:rPr>
-        <w:br/>
-        <w:t xml:space="preserve">    public Application(IUIFactory factory)</w:t>
-      </w:r>
-      <w:r>
-        <w:rPr>
-          <w:rFonts w:ascii="Courier New" w:hAnsi="Courier New" w:cs="Courier New"/>
-          <w:noProof/>
-          <w:color w:val="000000" w:themeColor="text1"/>
-          <w:lang w:val="uk-UA"/>
-        </w:rPr>
-        <w:br/>
-        <w:t xml:space="preserve">    {</w:t>
-      </w:r>
-      <w:r>
-        <w:rPr>
-          <w:rFonts w:ascii="Courier New" w:hAnsi="Courier New" w:cs="Courier New"/>
-          <w:noProof/>
-          <w:color w:val="000000" w:themeColor="text1"/>
-          <w:lang w:val="uk-UA"/>
-        </w:rPr>
-        <w:br/>
-        <w:t xml:space="preserve">        _button = factory.CreateButton();</w:t>
-      </w:r>
-      <w:r>
-        <w:rPr>
-          <w:rFonts w:ascii="Courier New" w:hAnsi="Courier New" w:cs="Courier New"/>
-          <w:noProof/>
-          <w:color w:val="000000" w:themeColor="text1"/>
-          <w:lang w:val="uk-UA"/>
-        </w:rPr>
-        <w:br/>
-        <w:t xml:space="preserve">        _checkbox = factory.CreateCheckbox();</w:t>
-      </w:r>
-      <w:r>
-        <w:rPr>
-          <w:rFonts w:ascii="Courier New" w:hAnsi="Courier New" w:cs="Courier New"/>
-          <w:noProof/>
-          <w:color w:val="000000" w:themeColor="text1"/>
-          <w:lang w:val="uk-UA"/>
-        </w:rPr>
-        <w:br/>
-        <w:t xml:space="preserve">    }</w:t>
-      </w:r>
-      <w:r>
-        <w:rPr>
-          <w:rFonts w:ascii="Courier New" w:hAnsi="Courier New" w:cs="Courier New"/>
-          <w:noProof/>
-          <w:color w:val="000000" w:themeColor="text1"/>
-          <w:lang w:val="uk-UA"/>
-        </w:rPr>
-        <w:br/>
-      </w:r>
-      <w:r>
-        <w:rPr>
-          <w:rFonts w:ascii="Courier New" w:hAnsi="Courier New" w:cs="Courier New"/>
-          <w:noProof/>
-          <w:color w:val="000000" w:themeColor="text1"/>
-          <w:lang w:val="uk-UA"/>
-        </w:rPr>
-        <w:br/>
-        <w:t xml:space="preserve">    public void RenderUI()</w:t>
-      </w:r>
-      <w:r>
-        <w:rPr>
-          <w:rFonts w:ascii="Courier New" w:hAnsi="Courier New" w:cs="Courier New"/>
-          <w:noProof/>
-          <w:color w:val="000000" w:themeColor="text1"/>
-          <w:lang w:val="uk-UA"/>
-        </w:rPr>
-        <w:br/>
-        <w:t xml:space="preserve">    {</w:t>
-      </w:r>
-      <w:r>
-        <w:rPr>
-          <w:rFonts w:ascii="Courier New" w:hAnsi="Courier New" w:cs="Courier New"/>
-          <w:noProof/>
-          <w:color w:val="000000" w:themeColor="text1"/>
-          <w:lang w:val="uk-UA"/>
-        </w:rPr>
-        <w:br/>
-        <w:t xml:space="preserve">        Console.WriteLine("Рендеринг інтерфейсу");</w:t>
-      </w:r>
-      <w:r>
-        <w:rPr>
-          <w:rFonts w:ascii="Courier New" w:hAnsi="Courier New" w:cs="Courier New"/>
-          <w:noProof/>
-          <w:color w:val="000000" w:themeColor="text1"/>
-          <w:lang w:val="uk-UA"/>
-        </w:rPr>
-        <w:br/>
-        <w:t xml:space="preserve">        _button.Render();</w:t>
-      </w:r>
-      <w:r>
-        <w:rPr>
-          <w:rFonts w:ascii="Courier New" w:hAnsi="Courier New" w:cs="Courier New"/>
-          <w:noProof/>
-          <w:color w:val="000000" w:themeColor="text1"/>
-          <w:lang w:val="uk-UA"/>
-        </w:rPr>
-        <w:br/>
-        <w:t xml:space="preserve">        _checkbox.Render();</w:t>
-      </w:r>
-      <w:r>
-        <w:rPr>
-          <w:rFonts w:ascii="Courier New" w:hAnsi="Courier New" w:cs="Courier New"/>
-          <w:noProof/>
-          <w:color w:val="000000" w:themeColor="text1"/>
-          <w:lang w:val="uk-UA"/>
-        </w:rPr>
-        <w:br/>
-        <w:t xml:space="preserve">    }</w:t>
-      </w:r>
-      <w:r>
-        <w:rPr>
-          <w:rFonts w:ascii="Courier New" w:hAnsi="Courier New" w:cs="Courier New"/>
-          <w:noProof/>
-          <w:color w:val="000000" w:themeColor="text1"/>
-          <w:lang w:val="uk-UA"/>
-        </w:rPr>
-        <w:br/>
-      </w:r>
-      <w:r>
-        <w:rPr>
-          <w:rFonts w:ascii="Courier New" w:hAnsi="Courier New" w:cs="Courier New"/>
-          <w:noProof/>
-          <w:color w:val="000000" w:themeColor="text1"/>
-          <w:lang w:val="uk-UA"/>
-        </w:rPr>
-        <w:br/>
-        <w:t xml:space="preserve">    public void SimulateUserInteraction()</w:t>
-      </w:r>
-      <w:r>
-        <w:rPr>
-          <w:rFonts w:ascii="Courier New" w:hAnsi="Courier New" w:cs="Courier New"/>
-          <w:noProof/>
-          <w:color w:val="000000" w:themeColor="text1"/>
-          <w:lang w:val="uk-UA"/>
-        </w:rPr>
-        <w:br/>
-        <w:t xml:space="preserve">    {</w:t>
-      </w:r>
-      <w:r>
-        <w:rPr>
-          <w:rFonts w:ascii="Courier New" w:hAnsi="Courier New" w:cs="Courier New"/>
-          <w:noProof/>
-          <w:color w:val="000000" w:themeColor="text1"/>
-          <w:lang w:val="uk-UA"/>
-        </w:rPr>
-        <w:br/>
-        <w:t xml:space="preserve">        Console.WriteLine("\nВзаємодія з користувачем");</w:t>
-      </w:r>
-      <w:r>
-        <w:rPr>
-          <w:rFonts w:ascii="Courier New" w:hAnsi="Courier New" w:cs="Courier New"/>
-          <w:noProof/>
-          <w:color w:val="000000" w:themeColor="text1"/>
-          <w:lang w:val="uk-UA"/>
-        </w:rPr>
-        <w:br/>
-        <w:t xml:space="preserve">        _button.OnClick();</w:t>
-      </w:r>
-      <w:r>
-        <w:rPr>
-          <w:rFonts w:ascii="Courier New" w:hAnsi="Courier New" w:cs="Courier New"/>
-          <w:noProof/>
-          <w:color w:val="000000" w:themeColor="text1"/>
-          <w:lang w:val="uk-UA"/>
-        </w:rPr>
-        <w:br/>
-        <w:t xml:space="preserve">        _checkbox.OnClick();</w:t>
-      </w:r>
-      <w:r>
-        <w:rPr>
-          <w:rFonts w:ascii="Courier New" w:hAnsi="Courier New" w:cs="Courier New"/>
-          <w:noProof/>
-          <w:color w:val="000000" w:themeColor="text1"/>
-          <w:lang w:val="uk-UA"/>
-        </w:rPr>
-        <w:br/>
-        <w:t xml:space="preserve">    }</w:t>
-      </w:r>
-      <w:r>
-        <w:rPr>
-          <w:rFonts w:ascii="Courier New" w:hAnsi="Courier New" w:cs="Courier New"/>
-          <w:noProof/>
-          <w:color w:val="000000" w:themeColor="text1"/>
-          <w:lang w:val="uk-UA"/>
-        </w:rPr>
-        <w:br/>
-        <w:t>}</w:t>
-      </w:r>
-    </w:p>
-    <w:p>
-      <w:pPr>
-        <w:spacing w:line="360" w:lineRule="auto"/>
-        <w:rPr>
-          <w:noProof/>
-          <w:sz w:val="28"/>
-          <w:szCs w:val="28"/>
-          <w:lang w:val="uk-UA"/>
-        </w:rPr>
-      </w:pPr>
-    </w:p>
-    <w:p>
-      <w:pPr>
-        <w:spacing w:line="360" w:lineRule="auto"/>
-        <w:jc w:val="center"/>
-        <w:rPr>
-          <w:noProof/>
-          <w:sz w:val="28"/>
-          <w:szCs w:val="28"/>
-          <w:lang w:val="uk-UA"/>
-        </w:rPr>
-      </w:pPr>
-      <w:r>
-        <w:rPr>
-          <w:noProof/>
-          <w:sz w:val="28"/>
-          <w:szCs w:val="28"/>
-          <w:lang w:val="uk-UA"/>
-        </w:rPr>
-        <w:t>Program.cs</w:t>
-      </w:r>
-    </w:p>
-    <w:p>
-      <w:pPr>
-        <w:widowControl/>
-        <w:tabs>
-          <w:tab w:val="left" w:pos="916"/>
-          <w:tab w:val="left" w:pos="1832"/>
-          <w:tab w:val="left" w:pos="2748"/>
-          <w:tab w:val="left" w:pos="3664"/>
-          <w:tab w:val="left" w:pos="4580"/>
-          <w:tab w:val="left" w:pos="5496"/>
-          <w:tab w:val="left" w:pos="6412"/>
-          <w:tab w:val="left" w:pos="7328"/>
-          <w:tab w:val="left" w:pos="8244"/>
-          <w:tab w:val="left" w:pos="9160"/>
-          <w:tab w:val="left" w:pos="10076"/>
-          <w:tab w:val="left" w:pos="10992"/>
-          <w:tab w:val="left" w:pos="11908"/>
-          <w:tab w:val="left" w:pos="12824"/>
-          <w:tab w:val="left" w:pos="13740"/>
-          <w:tab w:val="left" w:pos="14656"/>
-        </w:tabs>
-        <w:spacing w:line="240" w:lineRule="auto"/>
-        <w:rPr>
-          <w:rFonts w:ascii="Courier New" w:hAnsi="Courier New" w:cs="Courier New"/>
-          <w:noProof/>
-          <w:color w:val="000000" w:themeColor="text1"/>
-          <w:lang w:val="uk-UA"/>
-        </w:rPr>
-      </w:pPr>
-      <w:r>
-        <w:rPr>
-          <w:rFonts w:ascii="Courier New" w:hAnsi="Courier New" w:cs="Courier New"/>
-          <w:noProof/>
-          <w:color w:val="000000" w:themeColor="text1"/>
-          <w:lang w:val="uk-UA"/>
-        </w:rPr>
-        <w:t>namespace abstract_factory</w:t>
-      </w:r>
-      <w:r>
-        <w:rPr>
-          <w:rFonts w:ascii="Courier New" w:hAnsi="Courier New" w:cs="Courier New"/>
-          <w:noProof/>
-          <w:color w:val="000000" w:themeColor="text1"/>
-          <w:lang w:val="uk-UA"/>
-        </w:rPr>
-        <w:br/>
-        <w:t>{</w:t>
-      </w:r>
-      <w:r>
-        <w:rPr>
-          <w:rFonts w:ascii="Courier New" w:hAnsi="Courier New" w:cs="Courier New"/>
-          <w:noProof/>
-          <w:color w:val="000000" w:themeColor="text1"/>
-          <w:lang w:val="uk-UA"/>
-        </w:rPr>
-        <w:br/>
-        <w:t xml:space="preserve">    public class Program</w:t>
-      </w:r>
-      <w:r>
-        <w:rPr>
-          <w:rFonts w:ascii="Courier New" w:hAnsi="Courier New" w:cs="Courier New"/>
-          <w:noProof/>
-          <w:color w:val="000000" w:themeColor="text1"/>
-          <w:lang w:val="uk-UA"/>
-        </w:rPr>
-        <w:br/>
-        <w:t xml:space="preserve">    {</w:t>
-      </w:r>
-      <w:r>
-        <w:rPr>
-          <w:rFonts w:ascii="Courier New" w:hAnsi="Courier New" w:cs="Courier New"/>
-          <w:noProof/>
-          <w:color w:val="000000" w:themeColor="text1"/>
-          <w:lang w:val="uk-UA"/>
-        </w:rPr>
-        <w:br/>
-        <w:t xml:space="preserve">        public static void Main(string[] args)</w:t>
-      </w:r>
-      <w:r>
-        <w:rPr>
-          <w:rFonts w:ascii="Courier New" w:hAnsi="Courier New" w:cs="Courier New"/>
-          <w:noProof/>
-          <w:color w:val="000000" w:themeColor="text1"/>
-          <w:lang w:val="uk-UA"/>
-        </w:rPr>
-        <w:br/>
-        <w:t xml:space="preserve">        {</w:t>
-      </w:r>
-      <w:r>
-        <w:rPr>
-          <w:rFonts w:ascii="Courier New" w:hAnsi="Courier New" w:cs="Courier New"/>
-          <w:noProof/>
-          <w:color w:val="000000" w:themeColor="text1"/>
-          <w:lang w:val="uk-UA"/>
-        </w:rPr>
-        <w:br/>
-        <w:t xml:space="preserve">            Console.OutputEncoding = System.Text.Encoding.UTF8;</w:t>
-      </w:r>
-      <w:r>
-        <w:rPr>
-          <w:rFonts w:ascii="Courier New" w:hAnsi="Courier New" w:cs="Courier New"/>
-          <w:noProof/>
-          <w:color w:val="000000" w:themeColor="text1"/>
-          <w:lang w:val="uk-UA"/>
-        </w:rPr>
-        <w:br/>
-        <w:t xml:space="preserve">                </w:t>
-      </w:r>
-      <w:r>
-        <w:rPr>
-          <w:rFonts w:ascii="Courier New" w:hAnsi="Courier New" w:cs="Courier New"/>
-          <w:noProof/>
-          <w:color w:val="000000" w:themeColor="text1"/>
-          <w:lang w:val="uk-UA"/>
-        </w:rPr>
-        <w:br/>
-        <w:t xml:space="preserve">            string currentOS = "Unix";</w:t>
-      </w:r>
-      <w:r>
-        <w:rPr>
-          <w:rFonts w:ascii="Courier New" w:hAnsi="Courier New" w:cs="Courier New"/>
-          <w:noProof/>
-          <w:color w:val="000000" w:themeColor="text1"/>
-          <w:lang w:val="uk-UA"/>
-        </w:rPr>
-        <w:br/>
-      </w:r>
-      <w:r>
-        <w:rPr>
-          <w:rFonts w:ascii="Courier New" w:hAnsi="Courier New" w:cs="Courier New"/>
-          <w:noProof/>
-          <w:color w:val="000000" w:themeColor="text1"/>
-          <w:lang w:val="uk-UA"/>
-        </w:rPr>
-        <w:br/>
-        <w:t xml:space="preserve">            Application app = ConfigureApplication(currentOS);</w:t>
-      </w:r>
-      <w:r>
-        <w:rPr>
-          <w:rFonts w:ascii="Courier New" w:hAnsi="Courier New" w:cs="Courier New"/>
-          <w:noProof/>
-          <w:color w:val="000000" w:themeColor="text1"/>
-          <w:lang w:val="uk-UA"/>
-        </w:rPr>
-        <w:br/>
-      </w:r>
-      <w:r>
-        <w:rPr>
-          <w:rFonts w:ascii="Courier New" w:hAnsi="Courier New" w:cs="Courier New"/>
-          <w:noProof/>
-          <w:color w:val="000000" w:themeColor="text1"/>
-          <w:lang w:val="uk-UA"/>
-        </w:rPr>
-        <w:br/>
-      </w:r>
-      <w:r>
-        <w:rPr>
-          <w:rFonts w:ascii="Courier New" w:hAnsi="Courier New" w:cs="Courier New"/>
-          <w:noProof/>
-          <w:color w:val="000000" w:themeColor="text1"/>
-          <w:lang w:val="uk-UA"/>
-        </w:rPr>
-        <w:lastRenderedPageBreak/>
-        <w:t xml:space="preserve">            if (app != null)</w:t>
-      </w:r>
-      <w:r>
-        <w:rPr>
-          <w:rFonts w:ascii="Courier New" w:hAnsi="Courier New" w:cs="Courier New"/>
-          <w:noProof/>
-          <w:color w:val="000000" w:themeColor="text1"/>
-          <w:lang w:val="uk-UA"/>
-        </w:rPr>
-        <w:br/>
-        <w:t xml:space="preserve">            {</w:t>
-      </w:r>
-      <w:r>
-        <w:rPr>
-          <w:rFonts w:ascii="Courier New" w:hAnsi="Courier New" w:cs="Courier New"/>
-          <w:noProof/>
-          <w:color w:val="000000" w:themeColor="text1"/>
-          <w:lang w:val="uk-UA"/>
-        </w:rPr>
-        <w:br/>
-        <w:t xml:space="preserve">                app.RenderUI();</w:t>
-      </w:r>
-      <w:r>
-        <w:rPr>
-          <w:rFonts w:ascii="Courier New" w:hAnsi="Courier New" w:cs="Courier New"/>
-          <w:noProof/>
-          <w:color w:val="000000" w:themeColor="text1"/>
-          <w:lang w:val="uk-UA"/>
-        </w:rPr>
-        <w:br/>
-        <w:t xml:space="preserve">                app.SimulateUserInteraction();</w:t>
-      </w:r>
-      <w:r>
-        <w:rPr>
-          <w:rFonts w:ascii="Courier New" w:hAnsi="Courier New" w:cs="Courier New"/>
-          <w:noProof/>
-          <w:color w:val="000000" w:themeColor="text1"/>
-          <w:lang w:val="uk-UA"/>
-        </w:rPr>
-        <w:br/>
-        <w:t xml:space="preserve">            }</w:t>
-      </w:r>
-      <w:r>
-        <w:rPr>
-          <w:rFonts w:ascii="Courier New" w:hAnsi="Courier New" w:cs="Courier New"/>
-          <w:noProof/>
-          <w:color w:val="000000" w:themeColor="text1"/>
-          <w:lang w:val="uk-UA"/>
-        </w:rPr>
-        <w:br/>
-        <w:t xml:space="preserve">        }</w:t>
-      </w:r>
-      <w:r>
-        <w:rPr>
-          <w:rFonts w:ascii="Courier New" w:hAnsi="Courier New" w:cs="Courier New"/>
-          <w:noProof/>
-          <w:color w:val="000000" w:themeColor="text1"/>
-          <w:lang w:val="uk-UA"/>
-        </w:rPr>
-        <w:br/>
-      </w:r>
-      <w:r>
-        <w:rPr>
-          <w:rFonts w:ascii="Courier New" w:hAnsi="Courier New" w:cs="Courier New"/>
-          <w:noProof/>
-          <w:color w:val="000000" w:themeColor="text1"/>
-          <w:lang w:val="uk-UA"/>
-        </w:rPr>
-        <w:br/>
-        <w:t xml:space="preserve">        static Application ConfigureApplication(string os)</w:t>
-      </w:r>
-      <w:r>
-        <w:rPr>
-          <w:rFonts w:ascii="Courier New" w:hAnsi="Courier New" w:cs="Courier New"/>
-          <w:noProof/>
-          <w:color w:val="000000" w:themeColor="text1"/>
-          <w:lang w:val="uk-UA"/>
-        </w:rPr>
-        <w:br/>
-        <w:t xml:space="preserve">        {</w:t>
-      </w:r>
-      <w:r>
-        <w:rPr>
-          <w:rFonts w:ascii="Courier New" w:hAnsi="Courier New" w:cs="Courier New"/>
-          <w:noProof/>
-          <w:color w:val="000000" w:themeColor="text1"/>
-          <w:lang w:val="uk-UA"/>
-        </w:rPr>
-        <w:br/>
-        <w:t xml:space="preserve">            IUIFactory factory;</w:t>
-      </w:r>
-      <w:r>
-        <w:rPr>
-          <w:rFonts w:ascii="Courier New" w:hAnsi="Courier New" w:cs="Courier New"/>
-          <w:noProof/>
-          <w:color w:val="000000" w:themeColor="text1"/>
-          <w:lang w:val="uk-UA"/>
-        </w:rPr>
-        <w:br/>
-      </w:r>
-      <w:r>
-        <w:rPr>
-          <w:rFonts w:ascii="Courier New" w:hAnsi="Courier New" w:cs="Courier New"/>
-          <w:noProof/>
-          <w:color w:val="000000" w:themeColor="text1"/>
-          <w:lang w:val="uk-UA"/>
-        </w:rPr>
-        <w:br/>
-        <w:t xml:space="preserve">            if (os.Equals("Windows", StringComparison.</w:t>
-      </w:r>
-      <w:r>
-        <w:rPr>
-          <w:rFonts w:ascii="Courier New" w:hAnsi="Courier New" w:cs="Courier New"/>
-          <w:b/>
-          <w:bCs/>
-          <w:noProof/>
-          <w:color w:val="000000" w:themeColor="text1"/>
-          <w:lang w:val="uk-UA"/>
-        </w:rPr>
-        <w:t>OrdinalIgnoreCase</w:t>
-      </w:r>
-      <w:r>
-        <w:rPr>
-          <w:rFonts w:ascii="Courier New" w:hAnsi="Courier New" w:cs="Courier New"/>
-          <w:noProof/>
-          <w:color w:val="000000" w:themeColor="text1"/>
-          <w:lang w:val="uk-UA"/>
-        </w:rPr>
-        <w:t>))</w:t>
-      </w:r>
-      <w:r>
-        <w:rPr>
-          <w:rFonts w:ascii="Courier New" w:hAnsi="Courier New" w:cs="Courier New"/>
-          <w:noProof/>
-          <w:color w:val="000000" w:themeColor="text1"/>
-          <w:lang w:val="uk-UA"/>
-        </w:rPr>
-        <w:br/>
-        <w:t xml:space="preserve">            {</w:t>
-      </w:r>
-      <w:r>
-        <w:rPr>
-          <w:rFonts w:ascii="Courier New" w:hAnsi="Courier New" w:cs="Courier New"/>
-          <w:noProof/>
-          <w:color w:val="000000" w:themeColor="text1"/>
-          <w:lang w:val="uk-UA"/>
-        </w:rPr>
-        <w:br/>
-        <w:t xml:space="preserve">                factory = new WindowsFactory();</w:t>
-      </w:r>
-      <w:r>
-        <w:rPr>
-          <w:rFonts w:ascii="Courier New" w:hAnsi="Courier New" w:cs="Courier New"/>
-          <w:noProof/>
-          <w:color w:val="000000" w:themeColor="text1"/>
-          <w:lang w:val="uk-UA"/>
-        </w:rPr>
-        <w:br/>
-        <w:t xml:space="preserve">            }</w:t>
-      </w:r>
-      <w:r>
-        <w:rPr>
-          <w:rFonts w:ascii="Courier New" w:hAnsi="Courier New" w:cs="Courier New"/>
-          <w:noProof/>
-          <w:color w:val="000000" w:themeColor="text1"/>
-          <w:lang w:val="uk-UA"/>
-        </w:rPr>
-        <w:br/>
-        <w:t xml:space="preserve">            else if (os.Equals("Mac", StringComparison.</w:t>
-      </w:r>
-      <w:r>
-        <w:rPr>
-          <w:rFonts w:ascii="Courier New" w:hAnsi="Courier New" w:cs="Courier New"/>
-          <w:b/>
-          <w:bCs/>
-          <w:noProof/>
-          <w:color w:val="000000" w:themeColor="text1"/>
-          <w:lang w:val="uk-UA"/>
-        </w:rPr>
-        <w:t>OrdinalIgnoreCase</w:t>
-      </w:r>
-      <w:r>
-        <w:rPr>
-          <w:rFonts w:ascii="Courier New" w:hAnsi="Courier New" w:cs="Courier New"/>
-          <w:noProof/>
-          <w:color w:val="000000" w:themeColor="text1"/>
-          <w:lang w:val="uk-UA"/>
-        </w:rPr>
-        <w:t>))</w:t>
-      </w:r>
-      <w:r>
-        <w:rPr>
-          <w:rFonts w:ascii="Courier New" w:hAnsi="Courier New" w:cs="Courier New"/>
-          <w:noProof/>
-          <w:color w:val="000000" w:themeColor="text1"/>
-          <w:lang w:val="uk-UA"/>
-        </w:rPr>
-        <w:br/>
-        <w:t xml:space="preserve">            {</w:t>
-      </w:r>
-      <w:r>
-        <w:rPr>
-          <w:rFonts w:ascii="Courier New" w:hAnsi="Courier New" w:cs="Courier New"/>
-          <w:noProof/>
-          <w:color w:val="000000" w:themeColor="text1"/>
-          <w:lang w:val="uk-UA"/>
-        </w:rPr>
-        <w:br/>
-        <w:t xml:space="preserve">                factory = new MacFactory();</w:t>
-      </w:r>
-      <w:r>
-        <w:rPr>
-          <w:rFonts w:ascii="Courier New" w:hAnsi="Courier New" w:cs="Courier New"/>
-          <w:noProof/>
-          <w:color w:val="000000" w:themeColor="text1"/>
-          <w:lang w:val="uk-UA"/>
-        </w:rPr>
-        <w:br/>
-        <w:t xml:space="preserve">            }</w:t>
-      </w:r>
-      <w:r>
-        <w:rPr>
-          <w:rFonts w:ascii="Courier New" w:hAnsi="Courier New" w:cs="Courier New"/>
-          <w:noProof/>
-          <w:color w:val="000000" w:themeColor="text1"/>
-          <w:lang w:val="uk-UA"/>
-        </w:rPr>
-        <w:br/>
-        <w:t xml:space="preserve">            else</w:t>
-      </w:r>
-      <w:r>
-        <w:rPr>
-          <w:rFonts w:ascii="Courier New" w:hAnsi="Courier New" w:cs="Courier New"/>
-          <w:noProof/>
-          <w:color w:val="000000" w:themeColor="text1"/>
-          <w:lang w:val="uk-UA"/>
-        </w:rPr>
-        <w:br/>
-        <w:t xml:space="preserve">            {</w:t>
-      </w:r>
-      <w:r>
-        <w:rPr>
-          <w:rFonts w:ascii="Courier New" w:hAnsi="Courier New" w:cs="Courier New"/>
-          <w:noProof/>
-          <w:color w:val="000000" w:themeColor="text1"/>
-          <w:lang w:val="uk-UA"/>
-        </w:rPr>
-        <w:br/>
-        <w:t xml:space="preserve">                Console.WriteLine($"Помилка: ОС '{os}' не підтримується.");</w:t>
-      </w:r>
-      <w:r>
-        <w:rPr>
-          <w:rFonts w:ascii="Courier New" w:hAnsi="Courier New" w:cs="Courier New"/>
-          <w:noProof/>
-          <w:color w:val="000000" w:themeColor="text1"/>
-          <w:lang w:val="uk-UA"/>
-        </w:rPr>
-        <w:br/>
-        <w:t xml:space="preserve">                return null;</w:t>
-      </w:r>
-      <w:r>
-        <w:rPr>
-          <w:rFonts w:ascii="Courier New" w:hAnsi="Courier New" w:cs="Courier New"/>
-          <w:noProof/>
-          <w:color w:val="000000" w:themeColor="text1"/>
-          <w:lang w:val="uk-UA"/>
-        </w:rPr>
-        <w:br/>
-        <w:t xml:space="preserve">            }</w:t>
-      </w:r>
-      <w:r>
-        <w:rPr>
-          <w:rFonts w:ascii="Courier New" w:hAnsi="Courier New" w:cs="Courier New"/>
-          <w:noProof/>
-          <w:color w:val="000000" w:themeColor="text1"/>
-          <w:lang w:val="uk-UA"/>
-        </w:rPr>
-        <w:br/>
-      </w:r>
-      <w:r>
-        <w:rPr>
-          <w:rFonts w:ascii="Courier New" w:hAnsi="Courier New" w:cs="Courier New"/>
-          <w:noProof/>
-          <w:color w:val="000000" w:themeColor="text1"/>
-          <w:lang w:val="uk-UA"/>
-        </w:rPr>
-        <w:br/>
-        <w:t xml:space="preserve">            return new Application(factory);</w:t>
-      </w:r>
-      <w:r>
-        <w:rPr>
-          <w:rFonts w:ascii="Courier New" w:hAnsi="Courier New" w:cs="Courier New"/>
-          <w:noProof/>
-          <w:color w:val="000000" w:themeColor="text1"/>
-          <w:lang w:val="uk-UA"/>
-        </w:rPr>
-        <w:br/>
-        <w:t xml:space="preserve">        }</w:t>
-      </w:r>
-      <w:r>
-        <w:rPr>
-          <w:rFonts w:ascii="Courier New" w:hAnsi="Courier New" w:cs="Courier New"/>
-          <w:noProof/>
-          <w:color w:val="000000" w:themeColor="text1"/>
-          <w:lang w:val="uk-UA"/>
-        </w:rPr>
-        <w:br/>
-        <w:t xml:space="preserve">    }</w:t>
-      </w:r>
-      <w:r>
-        <w:rPr>
-          <w:rFonts w:ascii="Courier New" w:hAnsi="Courier New" w:cs="Courier New"/>
-          <w:noProof/>
-          <w:color w:val="000000" w:themeColor="text1"/>
-          <w:lang w:val="uk-UA"/>
-        </w:rPr>
-        <w:br/>
-        <w:t>}</w:t>
-      </w:r>
-    </w:p>
-    <w:p>
-      <w:pPr>
-        <w:spacing w:line="360" w:lineRule="auto"/>
-        <w:rPr>
-          <w:noProof/>
-          <w:sz w:val="28"/>
-          <w:szCs w:val="28"/>
-          <w:lang w:val="uk-UA"/>
-        </w:rPr>
-      </w:pPr>
-    </w:p>
-    <w:p>
-      <w:pPr>
-        <w:spacing w:line="360" w:lineRule="auto"/>
-        <w:ind w:firstLine="709"/>
-        <w:rPr>
-          <w:noProof/>
-          <w:sz w:val="28"/>
-          <w:szCs w:val="28"/>
-          <w:lang w:val="uk-UA"/>
-        </w:rPr>
-      </w:pPr>
-      <w:r>
-        <w:rPr>
-          <w:noProof/>
-          <w:sz w:val="28"/>
-          <w:szCs w:val="28"/>
-          <w:lang w:val="uk-UA"/>
-        </w:rPr>
-        <w:t>При запуску програми (з параметром currentOS = "Windows") в консоль виводиться наступний результат:</w:t>
-      </w:r>
-    </w:p>
-    <w:p>
-      <w:pPr>
-        <w:spacing w:line="360" w:lineRule="auto"/>
-        <w:rPr>
-          <w:noProof/>
-          <w:sz w:val="28"/>
-          <w:szCs w:val="28"/>
-          <w:lang w:val="uk-UA"/>
+          <w:lang w:val="en-US"/>
         </w:rPr>
       </w:pPr>
       <w:r>
@@ -6216,10 +4759,59 @@
           <w:lang w:val="uk-UA"/>
         </w:rPr>
         <w:drawing>
-          <wp:inline distT="0" distB="0" distL="0" distR="0" wp14:anchorId="675BAE0C" wp14:editId="1F9D0ED0">
-            <wp:extent cx="6480175" cy="2058035"/>
-            <wp:effectExtent l="0" t="0" r="0" b="0"/>
+          <wp:inline distT="0" distB="0" distL="0" distR="0" wp14:anchorId="675BAE0C" wp14:editId="57633263">
+            <wp:extent cx="3004363" cy="1944000"/>
+            <wp:effectExtent l="0" t="0" r="5715" b="0"/>
             <wp:docPr id="14" name="Рисунок 14"/>
+            <wp:cNvGraphicFramePr>
+              <a:graphicFrameLocks xmlns:a="http://schemas.openxmlformats.org/drawingml/2006/main" noChangeAspect="1"/>
+            </wp:cNvGraphicFramePr>
+            <a:graphic xmlns:a="http://schemas.openxmlformats.org/drawingml/2006/main">
+              <a:graphicData uri="http://schemas.openxmlformats.org/drawingml/2006/picture">
+                <pic:pic xmlns:pic="http://schemas.openxmlformats.org/drawingml/2006/picture">
+                  <pic:nvPicPr>
+                    <pic:cNvPr id="14" name="Рисунок 14"/>
+                    <pic:cNvPicPr/>
+                  </pic:nvPicPr>
+                  <pic:blipFill>
+                    <a:blip r:embed="rId11">
+                      <a:extLst>
+                        <a:ext uri="{28A0092B-C50C-407E-A947-70E740481C1C}">
+                          <a14:useLocalDpi xmlns:a14="http://schemas.microsoft.com/office/drawing/2010/main" val="0"/>
+                        </a:ext>
+                      </a:extLst>
+                    </a:blip>
+                    <a:stretch>
+                      <a:fillRect/>
+                    </a:stretch>
+                  </pic:blipFill>
+                  <pic:spPr>
+                    <a:xfrm>
+                      <a:off x="0" y="0"/>
+                      <a:ext cx="3004363" cy="1944000"/>
+                    </a:xfrm>
+                    <a:prstGeom prst="rect">
+                      <a:avLst/>
+                    </a:prstGeom>
+                  </pic:spPr>
+                </pic:pic>
+              </a:graphicData>
+            </a:graphic>
+          </wp:inline>
+        </w:drawing>
+      </w:r>
+      <w:r>
+        <w:rPr>
+          <w:noProof/>
+          <w:sz w:val="28"/>
+          <w:szCs w:val="28"/>
+          <w:lang w:val="en-US"/>
+        </w:rPr>
+        <w:drawing>
+          <wp:inline distT="0" distB="0" distL="0" distR="0" wp14:anchorId="3941F6E8" wp14:editId="693A50B0">
+            <wp:extent cx="3367773" cy="1944000"/>
+            <wp:effectExtent l="0" t="0" r="4445" b="0"/>
+            <wp:docPr id="5" name="Рисунок 5"/>
             <wp:cNvGraphicFramePr>
               <a:graphicFrameLocks xmlns:a="http://schemas.openxmlformats.org/drawingml/2006/main" noChangeAspect="1"/>
             </wp:cNvGraphicFramePr>
@@ -6239,7 +4831,7 @@
                   <pic:spPr>
                     <a:xfrm>
                       <a:off x="0" y="0"/>
-                      <a:ext cx="6480175" cy="2058035"/>
+                      <a:ext cx="3367773" cy="1944000"/>
                     </a:xfrm>
                     <a:prstGeom prst="rect">
                       <a:avLst/>
@@ -6251,6 +4843,28 @@
           </wp:inline>
         </w:drawing>
       </w:r>
+    </w:p>
+    <w:p>
+      <w:pPr>
+        <w:spacing w:line="360" w:lineRule="auto"/>
+        <w:rPr>
+          <w:noProof/>
+          <w:sz w:val="28"/>
+          <w:szCs w:val="28"/>
+          <w:lang w:val="en-US"/>
+        </w:rPr>
+      </w:pPr>
+    </w:p>
+    <w:p>
+      <w:pPr>
+        <w:spacing w:line="360" w:lineRule="auto"/>
+        <w:rPr>
+          <w:noProof/>
+          <w:sz w:val="28"/>
+          <w:szCs w:val="28"/>
+          <w:lang w:val="en-US"/>
+        </w:rPr>
+      </w:pPr>
     </w:p>
     <w:p>
       <w:pPr>
@@ -6392,14 +5006,15 @@
   <w:abstractNum w:abstractNumId="1" w15:restartNumberingAfterBreak="0">
     <w:nsid w:val="1FBB77BB"/>
     <w:multiLevelType w:val="hybridMultilevel"/>
-    <w:tmpl w:val="96968DDC"/>
-    <w:lvl w:ilvl="0" w:tplc="0422000F">
+    <w:tmpl w:val="1AFCB6F4"/>
+    <w:lvl w:ilvl="0" w:tplc="693EDF20">
       <w:start w:val="1"/>
       <w:numFmt w:val="decimal"/>
+      <w:suff w:val="space"/>
       <w:lvlText w:val="%1."/>
       <w:lvlJc w:val="left"/>
       <w:pPr>
-        <w:ind w:left="720" w:hanging="360"/>
+        <w:ind w:left="567" w:firstLine="142"/>
       </w:pPr>
       <w:rPr>
         <w:rFonts w:hint="default"/>
@@ -6479,6 +5094,96 @@
     </w:lvl>
   </w:abstractNum>
   <w:abstractNum w:abstractNumId="2" w15:restartNumberingAfterBreak="0">
+    <w:nsid w:val="456D2720"/>
+    <w:multiLevelType w:val="hybridMultilevel"/>
+    <w:tmpl w:val="5B84569E"/>
+    <w:lvl w:ilvl="0" w:tplc="4ADC687E">
+      <w:start w:val="1"/>
+      <w:numFmt w:val="decimal"/>
+      <w:suff w:val="space"/>
+      <w:lvlText w:val="%1."/>
+      <w:lvlJc w:val="left"/>
+      <w:pPr>
+        <w:ind w:left="567" w:firstLine="142"/>
+      </w:pPr>
+      <w:rPr>
+        <w:rFonts w:hint="default"/>
+      </w:rPr>
+    </w:lvl>
+    <w:lvl w:ilvl="1" w:tplc="04220019" w:tentative="1">
+      <w:start w:val="1"/>
+      <w:numFmt w:val="lowerLetter"/>
+      <w:lvlText w:val="%2."/>
+      <w:lvlJc w:val="left"/>
+      <w:pPr>
+        <w:ind w:left="1440" w:hanging="360"/>
+      </w:pPr>
+    </w:lvl>
+    <w:lvl w:ilvl="2" w:tplc="0422001B" w:tentative="1">
+      <w:start w:val="1"/>
+      <w:numFmt w:val="lowerRoman"/>
+      <w:lvlText w:val="%3."/>
+      <w:lvlJc w:val="right"/>
+      <w:pPr>
+        <w:ind w:left="2160" w:hanging="180"/>
+      </w:pPr>
+    </w:lvl>
+    <w:lvl w:ilvl="3" w:tplc="0422000F" w:tentative="1">
+      <w:start w:val="1"/>
+      <w:numFmt w:val="decimal"/>
+      <w:lvlText w:val="%4."/>
+      <w:lvlJc w:val="left"/>
+      <w:pPr>
+        <w:ind w:left="2880" w:hanging="360"/>
+      </w:pPr>
+    </w:lvl>
+    <w:lvl w:ilvl="4" w:tplc="04220019" w:tentative="1">
+      <w:start w:val="1"/>
+      <w:numFmt w:val="lowerLetter"/>
+      <w:lvlText w:val="%5."/>
+      <w:lvlJc w:val="left"/>
+      <w:pPr>
+        <w:ind w:left="3600" w:hanging="360"/>
+      </w:pPr>
+    </w:lvl>
+    <w:lvl w:ilvl="5" w:tplc="0422001B" w:tentative="1">
+      <w:start w:val="1"/>
+      <w:numFmt w:val="lowerRoman"/>
+      <w:lvlText w:val="%6."/>
+      <w:lvlJc w:val="right"/>
+      <w:pPr>
+        <w:ind w:left="4320" w:hanging="180"/>
+      </w:pPr>
+    </w:lvl>
+    <w:lvl w:ilvl="6" w:tplc="0422000F" w:tentative="1">
+      <w:start w:val="1"/>
+      <w:numFmt w:val="decimal"/>
+      <w:lvlText w:val="%7."/>
+      <w:lvlJc w:val="left"/>
+      <w:pPr>
+        <w:ind w:left="5040" w:hanging="360"/>
+      </w:pPr>
+    </w:lvl>
+    <w:lvl w:ilvl="7" w:tplc="04220019" w:tentative="1">
+      <w:start w:val="1"/>
+      <w:numFmt w:val="lowerLetter"/>
+      <w:lvlText w:val="%8."/>
+      <w:lvlJc w:val="left"/>
+      <w:pPr>
+        <w:ind w:left="5760" w:hanging="360"/>
+      </w:pPr>
+    </w:lvl>
+    <w:lvl w:ilvl="8" w:tplc="0422001B" w:tentative="1">
+      <w:start w:val="1"/>
+      <w:numFmt w:val="lowerRoman"/>
+      <w:lvlText w:val="%9."/>
+      <w:lvlJc w:val="right"/>
+      <w:pPr>
+        <w:ind w:left="6480" w:hanging="180"/>
+      </w:pPr>
+    </w:lvl>
+  </w:abstractNum>
+  <w:abstractNum w:abstractNumId="3" w15:restartNumberingAfterBreak="0">
     <w:nsid w:val="4F472E30"/>
     <w:multiLevelType w:val="multilevel"/>
     <w:tmpl w:val="A89276CC"/>
@@ -6616,7 +5321,7 @@
       </w:rPr>
     </w:lvl>
   </w:abstractNum>
-  <w:abstractNum w:abstractNumId="3" w15:restartNumberingAfterBreak="0">
+  <w:abstractNum w:abstractNumId="4" w15:restartNumberingAfterBreak="0">
     <w:nsid w:val="543256C7"/>
     <w:multiLevelType w:val="multilevel"/>
     <w:tmpl w:val="9C12E40A"/>
@@ -6702,7 +5407,7 @@
       </w:pPr>
     </w:lvl>
   </w:abstractNum>
-  <w:abstractNum w:abstractNumId="4" w15:restartNumberingAfterBreak="0">
+  <w:abstractNum w:abstractNumId="5" w15:restartNumberingAfterBreak="0">
     <w:nsid w:val="6A7969EA"/>
     <w:multiLevelType w:val="hybridMultilevel"/>
     <w:tmpl w:val="E7EA8EF2"/>
@@ -6788,7 +5493,7 @@
       </w:pPr>
     </w:lvl>
   </w:abstractNum>
-  <w:abstractNum w:abstractNumId="5" w15:restartNumberingAfterBreak="0">
+  <w:abstractNum w:abstractNumId="6" w15:restartNumberingAfterBreak="0">
     <w:nsid w:val="6EA165E6"/>
     <w:multiLevelType w:val="multilevel"/>
     <w:tmpl w:val="FF96A346"/>
@@ -6901,7 +5606,7 @@
       </w:rPr>
     </w:lvl>
   </w:abstractNum>
-  <w:abstractNum w:abstractNumId="6" w15:restartNumberingAfterBreak="0">
+  <w:abstractNum w:abstractNumId="7" w15:restartNumberingAfterBreak="0">
     <w:nsid w:val="7349779D"/>
     <w:multiLevelType w:val="hybridMultilevel"/>
     <w:tmpl w:val="1486C250"/>
@@ -6991,7 +5696,7 @@
       </w:pPr>
     </w:lvl>
   </w:abstractNum>
-  <w:abstractNum w:abstractNumId="7" w15:restartNumberingAfterBreak="0">
+  <w:abstractNum w:abstractNumId="8" w15:restartNumberingAfterBreak="0">
     <w:nsid w:val="78EF2D0B"/>
     <w:multiLevelType w:val="multilevel"/>
     <w:tmpl w:val="82685942"/>
@@ -7104,7 +5809,7 @@
       </w:pPr>
     </w:lvl>
   </w:abstractNum>
-  <w:abstractNum w:abstractNumId="8" w15:restartNumberingAfterBreak="0">
+  <w:abstractNum w:abstractNumId="9" w15:restartNumberingAfterBreak="0">
     <w:nsid w:val="7DC53BB9"/>
     <w:multiLevelType w:val="hybridMultilevel"/>
     <w:tmpl w:val="1B6C7CE6"/>
@@ -7195,31 +5900,34 @@
     </w:lvl>
   </w:abstractNum>
   <w:num w:numId="1" w16cid:durableId="465393416">
-    <w:abstractNumId w:val="5"/>
+    <w:abstractNumId w:val="6"/>
   </w:num>
   <w:num w:numId="2" w16cid:durableId="1629627543">
-    <w:abstractNumId w:val="3"/>
+    <w:abstractNumId w:val="4"/>
   </w:num>
   <w:num w:numId="3" w16cid:durableId="302003116">
-    <w:abstractNumId w:val="6"/>
+    <w:abstractNumId w:val="7"/>
   </w:num>
   <w:num w:numId="4" w16cid:durableId="1163619730">
-    <w:abstractNumId w:val="7"/>
+    <w:abstractNumId w:val="8"/>
   </w:num>
   <w:num w:numId="5" w16cid:durableId="1696229612">
     <w:abstractNumId w:val="0"/>
   </w:num>
   <w:num w:numId="6" w16cid:durableId="1315915509">
-    <w:abstractNumId w:val="8"/>
+    <w:abstractNumId w:val="9"/>
   </w:num>
   <w:num w:numId="7" w16cid:durableId="1467503937">
-    <w:abstractNumId w:val="2"/>
+    <w:abstractNumId w:val="3"/>
   </w:num>
   <w:num w:numId="8" w16cid:durableId="1111781259">
-    <w:abstractNumId w:val="4"/>
+    <w:abstractNumId w:val="5"/>
   </w:num>
   <w:num w:numId="9" w16cid:durableId="1351494290">
     <w:abstractNumId w:val="1"/>
+  </w:num>
+  <w:num w:numId="10" w16cid:durableId="838890644">
+    <w:abstractNumId w:val="2"/>
   </w:num>
 </w:numbering>
 </file>

</xml_diff>